<commit_message>
Add all figures and complete experiment data to IEEE paper
- Copy all 8 PNG figures to paper/figures/ for GitHub rendering
- Embed all images in Word, Markdown, and LaTeX paper
- Add 9 comprehensive tables (tiers, weights, routing, config, baselines, performance, targets, ablation, statistics)
- Include full statistical validation, appendix, and reproducibility info

Co-authored-by: meenakshi25jan <meenakshi25jan@users.noreply.github.com>
</commit_message>
<xml_diff>
--- a/tokencacheops/paper/TokenCacheOps_IEEE_Paper.docx
+++ b/tokencacheops/paper/TokenCacheOps_IEEE_Paper.docx
@@ -41,10 +41,7 @@
         <w:spacing w:after="120"/>
       </w:pPr>
       <w:r>
-        <w:rPr>
-          <w:b w:val="0"/>
-        </w:rPr>
-        <w:t>This paper presents TokenCacheOps, a cloud-agnostic architecture integrating a five-tier cache hierarchy, multi-factor retention scoring, semantic similarity matching, and task-aware model routing for enterprise AI workloads. We evaluate TokenCacheOps against five baseline strategies—LRU, LFU, semantic-only, prompt-only, and no optimization—using 100,000 synthetic enterprise requests across 30 independent experimental runs. TokenCacheOps achieves a 56.4% cache hit ratio (46.9% relative improvement over the best baseline), 38.7% token reduction, 45.6% inference cost reduction, and 85.1% latency reduction versus unoptimized inference. Statistical validation via one-way ANOVA (F=1193523, p&lt;0.001) and Welch's t-tests confirm significance with large effect sizes (Cohen's d &gt; 125). Ablation studies isolate the contribution of semantic reuse, business importance, influence rank, and penetration factor components. Results demonstrate that TokenCacheOps provides a practical, reproducible framework for AI FinOps governance in multi-cloud enterprise environments.</w:t>
+        <w:t>This paper presents TokenCacheOps, a cloud-agnostic architecture integrating a five-tier cache hierarchy, multi-factor retention scoring, semantic similarity matching (all-MiniLM-L6-v2), and task-aware model routing. Evaluated against five baselines using 100,000 synthetic enterprise requests over 30 independent runs, TokenCacheOps achieves 56.4% cache hit ratio (46.9% improvement over best baseline), 38.7% token reduction, 45.6% cost reduction, 19.2 req/s throughput, CEI of 549.2, and 52.3x ROI. ANOVA F=1193523, p&lt;0.001; Cohen's d&gt;125 vs. all baselines.</w:t>
       </w:r>
     </w:p>
     <w:p>
@@ -55,7 +52,7 @@
         <w:t>Index Terms—</w:t>
       </w:r>
       <w:r>
-        <w:t>semantic caching, token optimization, large language models, AI FinOps, enterprise AI, cache retention, model routing</w:t>
+        <w:t>semantic caching, token optimization, LLM, AI FinOps, enterprise AI, cache retention, model routing</w:t>
       </w:r>
     </w:p>
     <w:p>
@@ -71,21 +68,7 @@
         <w:spacing w:after="120"/>
       </w:pPr>
       <w:r>
-        <w:rPr>
-          <w:b w:val="0"/>
-        </w:rPr>
-        <w:t>Enterprise adoption of large language models (LLMs) has accelerated rapidly, yet organizations face escalating inference costs, latency constraints, and governance challenges across heterogeneous cloud environments. Repeated queries over shared enterprise corpora—security policies, compliance documents, architecture standards, and operational manuals—create substantial opportunities for intelligent caching, but traditional LRU and LFU strategies fail to capture semantic equivalence, business value, or cross-domain reuse patterns.</w:t>
-      </w:r>
-    </w:p>
-    <w:p>
-      <w:pPr>
-        <w:spacing w:after="120"/>
-      </w:pPr>
-      <w:r>
-        <w:rPr>
-          <w:b w:val="0"/>
-        </w:rPr>
-        <w:t>TokenCacheOps addresses these limitations through a unified architecture combining: (1) a five-tier cache hierarchy with differentiated retention policies; (2) a nine-factor retention scoring function; (3) embedding-based semantic similarity using sentence-transformers; and (4) task-aware model routing that directs workloads to appropriately sized models. This paper provides rigorous experimental validation demonstrating measurable improvements in token consumption, cache hit ratio, response latency, throughput, and cost.</w:t>
+        <w:t>Enterprise LLM deployments face escalating inference costs and latency constraints. TokenCacheOps addresses these through five-tier caching, nine-factor retention scoring, semantic reuse, and FinOps-aware model routing validated at 100,000-request scale.</w:t>
       </w:r>
     </w:p>
     <w:p>
@@ -101,10 +84,7 @@
         <w:spacing w:after="120"/>
       </w:pPr>
       <w:r>
-        <w:rPr>
-          <w:b w:val="0"/>
-        </w:rPr>
-        <w:t>Semantic caching for LLM applications [3] demonstrated that embedding-based similarity matching can reduce redundant inference. Prompt caching [4] exploits prefix overlap in transformer attention mechanisms. FrugalGPT [5] introduced cascading model selection for cost reduction. TokenCacheOps extends these approaches by integrating tiered retention, enterprise governance signals, and FinOps metrics into a cloud-agnostic framework validated at 100,000-request scale.</w:t>
+        <w:t>Prior work includes semantic caching [3], prompt caching [4], and FrugalGPT [5]. TokenCacheOps unifies tiered retention, enterprise governance signals, and FinOps metrics.</w:t>
       </w:r>
     </w:p>
     <w:p>
@@ -123,85 +103,222 @@
         <w:t>A. Five-Tier Cache Hierarchy</w:t>
       </w:r>
     </w:p>
+    <w:tbl>
+      <w:tblPr>
+        <w:tblStyle w:val="TableGrid"/>
+        <w:tblW w:type="auto" w:w="0"/>
+        <w:tblLook w:firstColumn="1" w:firstRow="1" w:lastColumn="0" w:lastRow="0" w:noHBand="0" w:noVBand="1" w:val="04A0"/>
+      </w:tblPr>
+      <w:tblGrid>
+        <w:gridCol w:w="2880"/>
+        <w:gridCol w:w="2880"/>
+        <w:gridCol w:w="2880"/>
+      </w:tblGrid>
+      <w:tr>
+        <w:tc>
+          <w:tcPr>
+            <w:tcW w:type="dxa" w:w="2880"/>
+          </w:tcPr>
+          <w:p>
+            <w:r>
+              <w:t>Tier</w:t>
+            </w:r>
+          </w:p>
+        </w:tc>
+        <w:tc>
+          <w:tcPr>
+            <w:tcW w:type="dxa" w:w="2880"/>
+          </w:tcPr>
+          <w:p>
+            <w:r>
+              <w:t>Capacity</w:t>
+            </w:r>
+          </w:p>
+        </w:tc>
+        <w:tc>
+          <w:tcPr>
+            <w:tcW w:type="dxa" w:w="2880"/>
+          </w:tcPr>
+          <w:p>
+            <w:r>
+              <w:t>Purpose</w:t>
+            </w:r>
+          </w:p>
+        </w:tc>
+      </w:tr>
+      <w:tr>
+        <w:tc>
+          <w:tcPr>
+            <w:tcW w:type="dxa" w:w="2880"/>
+          </w:tcPr>
+          <w:p>
+            <w:r>
+              <w:t>Strategic</w:t>
+            </w:r>
+          </w:p>
+        </w:tc>
+        <w:tc>
+          <w:tcPr>
+            <w:tcW w:type="dxa" w:w="2880"/>
+          </w:tcPr>
+          <w:p>
+            <w:r>
+              <w:t>5%</w:t>
+            </w:r>
+          </w:p>
+        </w:tc>
+        <w:tc>
+          <w:tcPr>
+            <w:tcW w:type="dxa" w:w="2880"/>
+          </w:tcPr>
+          <w:p>
+            <w:r>
+              <w:t>High business-value long-term retention</w:t>
+            </w:r>
+          </w:p>
+        </w:tc>
+      </w:tr>
+      <w:tr>
+        <w:tc>
+          <w:tcPr>
+            <w:tcW w:type="dxa" w:w="2880"/>
+          </w:tcPr>
+          <w:p>
+            <w:r>
+              <w:t>Evaluation</w:t>
+            </w:r>
+          </w:p>
+        </w:tc>
+        <w:tc>
+          <w:tcPr>
+            <w:tcW w:type="dxa" w:w="2880"/>
+          </w:tcPr>
+          <w:p>
+            <w:r>
+              <w:t>10%</w:t>
+            </w:r>
+          </w:p>
+        </w:tc>
+        <w:tc>
+          <w:tcPr>
+            <w:tcW w:type="dxa" w:w="2880"/>
+          </w:tcPr>
+          <w:p>
+            <w:r>
+              <w:t>Candidate promotion assessment</w:t>
+            </w:r>
+          </w:p>
+        </w:tc>
+      </w:tr>
+      <w:tr>
+        <w:tc>
+          <w:tcPr>
+            <w:tcW w:type="dxa" w:w="2880"/>
+          </w:tcPr>
+          <w:p>
+            <w:r>
+              <w:t>Hot Access</w:t>
+            </w:r>
+          </w:p>
+        </w:tc>
+        <w:tc>
+          <w:tcPr>
+            <w:tcW w:type="dxa" w:w="2880"/>
+          </w:tcPr>
+          <w:p>
+            <w:r>
+              <w:t>45%</w:t>
+            </w:r>
+          </w:p>
+        </w:tc>
+        <w:tc>
+          <w:tcPr>
+            <w:tcW w:type="dxa" w:w="2880"/>
+          </w:tcPr>
+          <w:p>
+            <w:r>
+              <w:t>Frequent low-latency retrieval</w:t>
+            </w:r>
+          </w:p>
+        </w:tc>
+      </w:tr>
+      <w:tr>
+        <w:tc>
+          <w:tcPr>
+            <w:tcW w:type="dxa" w:w="2880"/>
+          </w:tcPr>
+          <w:p>
+            <w:r>
+              <w:t>Archive</w:t>
+            </w:r>
+          </w:p>
+        </w:tc>
+        <w:tc>
+          <w:tcPr>
+            <w:tcW w:type="dxa" w:w="2880"/>
+          </w:tcPr>
+          <w:p>
+            <w:r>
+              <w:t>30%</w:t>
+            </w:r>
+          </w:p>
+        </w:tc>
+        <w:tc>
+          <w:tcPr>
+            <w:tcW w:type="dxa" w:w="2880"/>
+          </w:tcPr>
+          <w:p>
+            <w:r>
+              <w:t>Infrequent semantically valuable entries</w:t>
+            </w:r>
+          </w:p>
+        </w:tc>
+      </w:tr>
+      <w:tr>
+        <w:tc>
+          <w:tcPr>
+            <w:tcW w:type="dxa" w:w="2880"/>
+          </w:tcPr>
+          <w:p>
+            <w:r>
+              <w:t>Disposal</w:t>
+            </w:r>
+          </w:p>
+        </w:tc>
+        <w:tc>
+          <w:tcPr>
+            <w:tcW w:type="dxa" w:w="2880"/>
+          </w:tcPr>
+          <w:p>
+            <w:r>
+              <w:t>10%</w:t>
+            </w:r>
+          </w:p>
+        </w:tc>
+        <w:tc>
+          <w:tcPr>
+            <w:tcW w:type="dxa" w:w="2880"/>
+          </w:tcPr>
+          <w:p>
+            <w:r>
+              <w:t>Eviction staging and TTL expiry</w:t>
+            </w:r>
+          </w:p>
+        </w:tc>
+      </w:tr>
+    </w:tbl>
     <w:p>
       <w:pPr>
-        <w:spacing w:after="120"/>
+        <w:jc w:val="center"/>
       </w:pPr>
       <w:r>
         <w:rPr>
-          <w:b w:val="0"/>
+          <w:i/>
         </w:rPr>
-        <w:t>The cache is partitioned into five regions: Strategic (5% capacity) for high business-value entries; Evaluation (10%) for promotion candidates; Hot Access (45%) for frequent low-latency retrieval; Archive (30%) for infrequent but semantically valuable entries; and Disposal (10%) for eviction staging.</w:t>
+        <w:t>TABLE I. FIVE-TIER CACHE CAPACITY ALLOCATION</w:t>
       </w:r>
     </w:p>
-    <w:p>
-      <w:pPr>
-        <w:pStyle w:val="Heading2"/>
-      </w:pPr>
-      <w:r>
-        <w:t>B. Retention Scoring Formula</w:t>
-      </w:r>
-    </w:p>
-    <w:p>
-      <w:pPr>
-        <w:spacing w:after="120"/>
-      </w:pPr>
-      <w:r>
-        <w:rPr>
-          <w:b w:val="0"/>
-        </w:rPr>
-        <w:t>RetentionScore = w₁·Recency + w₂·Frequency + w₃·SemanticReuse + w₄·BusinessImportance + w₅·InfluenceRank + w₆·PenetrationFactor + w₇·TokenEfficiency + w₈·Freshness − w₉·SecuritySensitivity</w:t>
-      </w:r>
-    </w:p>
-    <w:p>
-      <w:pPr>
-        <w:spacing w:after="120"/>
-      </w:pPr>
-      <w:r>
-        <w:rPr>
-          <w:b w:val="0"/>
-        </w:rPr>
-        <w:t>Default weights: w₁=0.15, w₂=0.12, w₃=0.18, w₄=0.12, w₅=0.10, w₆=0.13, w₇=0.15, w₈=0.08, w₉=0.07. Entries scoring above 0.75 are promoted to hotter tiers; entries below 0.25 are demoted toward disposal.</w:t>
-      </w:r>
-    </w:p>
-    <w:p>
-      <w:pPr>
-        <w:pStyle w:val="Heading2"/>
-      </w:pPr>
-      <w:r>
-        <w:t>C. Semantic Similarity Engine</w:t>
-      </w:r>
-    </w:p>
-    <w:p>
-      <w:pPr>
-        <w:spacing w:after="120"/>
-      </w:pPr>
-      <w:r>
-        <w:rPr>
-          <w:b w:val="0"/>
-        </w:rPr>
-        <w:t>Query embeddings are computed using all-MiniLM-L6-v2 [2] with cosine similarity threshold τ=0.90. TokenCacheOps applies tier-aware threshold relaxation (up to −0.025 on the Hot Access tier) to balance precision and recall.</w:t>
-      </w:r>
-    </w:p>
-    <w:p>
-      <w:pPr>
-        <w:pStyle w:val="Heading2"/>
-      </w:pPr>
-      <w:r>
-        <w:t>D. Model Routing Engine</w:t>
-      </w:r>
-    </w:p>
-    <w:p>
-      <w:pPr>
-        <w:spacing w:after="120"/>
-      </w:pPr>
-      <w:r>
-        <w:rPr>
-          <w:b w:val="0"/>
-        </w:rPr>
-        <w:t>Tasks are routed as follows: Classification and Extraction → Small model; Retrieval, Summarization, and Question Answering → Medium model; Reasoning → Frontier model. Pricing follows OpenAI assumptions ($5/M input tokens, $15/M output tokens).</w:t>
-      </w:r>
-    </w:p>
+    <w:p/>
     <w:p>
       <w:r>
         <w:drawing>
@@ -243,7 +360,454 @@
         <w:jc w:val="center"/>
       </w:pPr>
       <w:r>
-        <w:t>Fig. 1. TokenCacheOps five-tier cache architecture.</w:t>
+        <w:rPr>
+          <w:i/>
+        </w:rPr>
+        <w:t>Fig. 1. TokenCacheOps five-tier cache architecture with semantic engine, retention scorer, model router, and FinOps layer.</w:t>
+      </w:r>
+    </w:p>
+    <w:p/>
+    <w:p>
+      <w:pPr>
+        <w:pStyle w:val="Heading2"/>
+      </w:pPr>
+      <w:r>
+        <w:t>B. Retention Scoring Formula</w:t>
+      </w:r>
+    </w:p>
+    <w:p>
+      <w:pPr>
+        <w:spacing w:after="120"/>
+      </w:pPr>
+      <w:r>
+        <w:t>RetentionScore = w₁·Recency + w₂·Frequency + w₃·SemanticReuse + w₄·BusinessImportance + w₅·InfluenceRank + w₆·PenetrationFactor + w₇·TokenEfficiency + w₈·Freshness − w₉·SecuritySensitivity</w:t>
+      </w:r>
+    </w:p>
+    <w:tbl>
+      <w:tblPr>
+        <w:tblStyle w:val="TableGrid"/>
+        <w:tblW w:type="auto" w:w="0"/>
+        <w:tblLook w:firstColumn="1" w:firstRow="1" w:lastColumn="0" w:lastRow="0" w:noHBand="0" w:noVBand="1" w:val="04A0"/>
+      </w:tblPr>
+      <w:tblGrid>
+        <w:gridCol w:w="4320"/>
+        <w:gridCol w:w="4320"/>
+      </w:tblGrid>
+      <w:tr>
+        <w:tc>
+          <w:tcPr>
+            <w:tcW w:type="dxa" w:w="4320"/>
+          </w:tcPr>
+          <w:p>
+            <w:r>
+              <w:t>Factor</w:t>
+            </w:r>
+          </w:p>
+        </w:tc>
+        <w:tc>
+          <w:tcPr>
+            <w:tcW w:type="dxa" w:w="4320"/>
+          </w:tcPr>
+          <w:p>
+            <w:r>
+              <w:t>Weight (w)</w:t>
+            </w:r>
+          </w:p>
+        </w:tc>
+      </w:tr>
+      <w:tr>
+        <w:tc>
+          <w:tcPr>
+            <w:tcW w:type="dxa" w:w="4320"/>
+          </w:tcPr>
+          <w:p>
+            <w:r>
+              <w:t>Recency</w:t>
+            </w:r>
+          </w:p>
+        </w:tc>
+        <w:tc>
+          <w:tcPr>
+            <w:tcW w:type="dxa" w:w="4320"/>
+          </w:tcPr>
+          <w:p>
+            <w:r>
+              <w:t>0.15</w:t>
+            </w:r>
+          </w:p>
+        </w:tc>
+      </w:tr>
+      <w:tr>
+        <w:tc>
+          <w:tcPr>
+            <w:tcW w:type="dxa" w:w="4320"/>
+          </w:tcPr>
+          <w:p>
+            <w:r>
+              <w:t>Frequency</w:t>
+            </w:r>
+          </w:p>
+        </w:tc>
+        <w:tc>
+          <w:tcPr>
+            <w:tcW w:type="dxa" w:w="4320"/>
+          </w:tcPr>
+          <w:p>
+            <w:r>
+              <w:t>0.12</w:t>
+            </w:r>
+          </w:p>
+        </w:tc>
+      </w:tr>
+      <w:tr>
+        <w:tc>
+          <w:tcPr>
+            <w:tcW w:type="dxa" w:w="4320"/>
+          </w:tcPr>
+          <w:p>
+            <w:r>
+              <w:t>SemanticReuse</w:t>
+            </w:r>
+          </w:p>
+        </w:tc>
+        <w:tc>
+          <w:tcPr>
+            <w:tcW w:type="dxa" w:w="4320"/>
+          </w:tcPr>
+          <w:p>
+            <w:r>
+              <w:t>0.18</w:t>
+            </w:r>
+          </w:p>
+        </w:tc>
+      </w:tr>
+      <w:tr>
+        <w:tc>
+          <w:tcPr>
+            <w:tcW w:type="dxa" w:w="4320"/>
+          </w:tcPr>
+          <w:p>
+            <w:r>
+              <w:t>BusinessImportance</w:t>
+            </w:r>
+          </w:p>
+        </w:tc>
+        <w:tc>
+          <w:tcPr>
+            <w:tcW w:type="dxa" w:w="4320"/>
+          </w:tcPr>
+          <w:p>
+            <w:r>
+              <w:t>0.12</w:t>
+            </w:r>
+          </w:p>
+        </w:tc>
+      </w:tr>
+      <w:tr>
+        <w:tc>
+          <w:tcPr>
+            <w:tcW w:type="dxa" w:w="4320"/>
+          </w:tcPr>
+          <w:p>
+            <w:r>
+              <w:t>InfluenceRank</w:t>
+            </w:r>
+          </w:p>
+        </w:tc>
+        <w:tc>
+          <w:tcPr>
+            <w:tcW w:type="dxa" w:w="4320"/>
+          </w:tcPr>
+          <w:p>
+            <w:r>
+              <w:t>0.1</w:t>
+            </w:r>
+          </w:p>
+        </w:tc>
+      </w:tr>
+      <w:tr>
+        <w:tc>
+          <w:tcPr>
+            <w:tcW w:type="dxa" w:w="4320"/>
+          </w:tcPr>
+          <w:p>
+            <w:r>
+              <w:t>PenetrationFactor</w:t>
+            </w:r>
+          </w:p>
+        </w:tc>
+        <w:tc>
+          <w:tcPr>
+            <w:tcW w:type="dxa" w:w="4320"/>
+          </w:tcPr>
+          <w:p>
+            <w:r>
+              <w:t>0.13</w:t>
+            </w:r>
+          </w:p>
+        </w:tc>
+      </w:tr>
+      <w:tr>
+        <w:tc>
+          <w:tcPr>
+            <w:tcW w:type="dxa" w:w="4320"/>
+          </w:tcPr>
+          <w:p>
+            <w:r>
+              <w:t>TokenEfficiency</w:t>
+            </w:r>
+          </w:p>
+        </w:tc>
+        <w:tc>
+          <w:tcPr>
+            <w:tcW w:type="dxa" w:w="4320"/>
+          </w:tcPr>
+          <w:p>
+            <w:r>
+              <w:t>0.15</w:t>
+            </w:r>
+          </w:p>
+        </w:tc>
+      </w:tr>
+      <w:tr>
+        <w:tc>
+          <w:tcPr>
+            <w:tcW w:type="dxa" w:w="4320"/>
+          </w:tcPr>
+          <w:p>
+            <w:r>
+              <w:t>Freshness</w:t>
+            </w:r>
+          </w:p>
+        </w:tc>
+        <w:tc>
+          <w:tcPr>
+            <w:tcW w:type="dxa" w:w="4320"/>
+          </w:tcPr>
+          <w:p>
+            <w:r>
+              <w:t>0.08</w:t>
+            </w:r>
+          </w:p>
+        </w:tc>
+      </w:tr>
+      <w:tr>
+        <w:tc>
+          <w:tcPr>
+            <w:tcW w:type="dxa" w:w="4320"/>
+          </w:tcPr>
+          <w:p>
+            <w:r>
+              <w:t>SecuritySensitivity</w:t>
+            </w:r>
+          </w:p>
+        </w:tc>
+        <w:tc>
+          <w:tcPr>
+            <w:tcW w:type="dxa" w:w="4320"/>
+          </w:tcPr>
+          <w:p>
+            <w:r>
+              <w:t>0.07</w:t>
+            </w:r>
+          </w:p>
+        </w:tc>
+      </w:tr>
+    </w:tbl>
+    <w:p>
+      <w:pPr>
+        <w:jc w:val="center"/>
+      </w:pPr>
+      <w:r>
+        <w:rPr>
+          <w:i/>
+        </w:rPr>
+        <w:t>TABLE II. RETENTION FORMULA WEIGHTS</w:t>
+      </w:r>
+    </w:p>
+    <w:p/>
+    <w:p>
+      <w:pPr>
+        <w:pStyle w:val="Heading2"/>
+      </w:pPr>
+      <w:r>
+        <w:t>C. Semantic Similarity Engine</w:t>
+      </w:r>
+    </w:p>
+    <w:p>
+      <w:pPr>
+        <w:spacing w:after="120"/>
+      </w:pPr>
+      <w:r>
+        <w:t>Embedding model: all-MiniLM-L6-v2. Metric: cosine similarity. Base threshold τ=0.90. Tier-aware relaxation up to −0.025 on Hot Access tier.</w:t>
+      </w:r>
+    </w:p>
+    <w:p>
+      <w:pPr>
+        <w:pStyle w:val="Heading2"/>
+      </w:pPr>
+      <w:r>
+        <w:t>D. Model Routing Engine</w:t>
+      </w:r>
+    </w:p>
+    <w:tbl>
+      <w:tblPr>
+        <w:tblStyle w:val="TableGrid"/>
+        <w:tblW w:type="auto" w:w="0"/>
+        <w:tblLook w:firstColumn="1" w:firstRow="1" w:lastColumn="0" w:lastRow="0" w:noHBand="0" w:noVBand="1" w:val="04A0"/>
+      </w:tblPr>
+      <w:tblGrid>
+        <w:gridCol w:w="2880"/>
+        <w:gridCol w:w="2880"/>
+        <w:gridCol w:w="2880"/>
+      </w:tblGrid>
+      <w:tr>
+        <w:tc>
+          <w:tcPr>
+            <w:tcW w:type="dxa" w:w="2880"/>
+          </w:tcPr>
+          <w:p>
+            <w:r>
+              <w:t>Task</w:t>
+            </w:r>
+          </w:p>
+        </w:tc>
+        <w:tc>
+          <w:tcPr>
+            <w:tcW w:type="dxa" w:w="2880"/>
+          </w:tcPr>
+          <w:p>
+            <w:r>
+              <w:t>Model</w:t>
+            </w:r>
+          </w:p>
+        </w:tc>
+        <w:tc>
+          <w:tcPr>
+            <w:tcW w:type="dxa" w:w="2880"/>
+          </w:tcPr>
+          <w:p>
+            <w:r>
+              <w:t>Relative Cost</w:t>
+            </w:r>
+          </w:p>
+        </w:tc>
+      </w:tr>
+      <w:tr>
+        <w:tc>
+          <w:tcPr>
+            <w:tcW w:type="dxa" w:w="2880"/>
+          </w:tcPr>
+          <w:p>
+            <w:r>
+              <w:t>Classification, Extraction</w:t>
+            </w:r>
+          </w:p>
+        </w:tc>
+        <w:tc>
+          <w:tcPr>
+            <w:tcW w:type="dxa" w:w="2880"/>
+          </w:tcPr>
+          <w:p>
+            <w:r>
+              <w:t>Small</w:t>
+            </w:r>
+          </w:p>
+        </w:tc>
+        <w:tc>
+          <w:tcPr>
+            <w:tcW w:type="dxa" w:w="2880"/>
+          </w:tcPr>
+          <w:p>
+            <w:r>
+              <w:t>0.15x</w:t>
+            </w:r>
+          </w:p>
+        </w:tc>
+      </w:tr>
+      <w:tr>
+        <w:tc>
+          <w:tcPr>
+            <w:tcW w:type="dxa" w:w="2880"/>
+          </w:tcPr>
+          <w:p>
+            <w:r>
+              <w:t>Retrieval, Summarization, Q&amp;A</w:t>
+            </w:r>
+          </w:p>
+        </w:tc>
+        <w:tc>
+          <w:tcPr>
+            <w:tcW w:type="dxa" w:w="2880"/>
+          </w:tcPr>
+          <w:p>
+            <w:r>
+              <w:t>Medium</w:t>
+            </w:r>
+          </w:p>
+        </w:tc>
+        <w:tc>
+          <w:tcPr>
+            <w:tcW w:type="dxa" w:w="2880"/>
+          </w:tcPr>
+          <w:p>
+            <w:r>
+              <w:t>0.45x</w:t>
+            </w:r>
+          </w:p>
+        </w:tc>
+      </w:tr>
+      <w:tr>
+        <w:tc>
+          <w:tcPr>
+            <w:tcW w:type="dxa" w:w="2880"/>
+          </w:tcPr>
+          <w:p>
+            <w:r>
+              <w:t>Reasoning</w:t>
+            </w:r>
+          </w:p>
+        </w:tc>
+        <w:tc>
+          <w:tcPr>
+            <w:tcW w:type="dxa" w:w="2880"/>
+          </w:tcPr>
+          <w:p>
+            <w:r>
+              <w:t>Frontier</w:t>
+            </w:r>
+          </w:p>
+        </w:tc>
+        <w:tc>
+          <w:tcPr>
+            <w:tcW w:type="dxa" w:w="2880"/>
+          </w:tcPr>
+          <w:p>
+            <w:r>
+              <w:t>1.0x</w:t>
+            </w:r>
+          </w:p>
+        </w:tc>
+      </w:tr>
+    </w:tbl>
+    <w:p>
+      <w:pPr>
+        <w:jc w:val="center"/>
+      </w:pPr>
+      <w:r>
+        <w:rPr>
+          <w:i/>
+        </w:rPr>
+        <w:t>TABLE III. TASK-AWARE MODEL ROUTING</w:t>
+      </w:r>
+    </w:p>
+    <w:p/>
+    <w:p>
+      <w:pPr>
+        <w:spacing w:after="120"/>
+      </w:pPr>
+      <w:r>
+        <w:t>Pricing: $5/M input tokens, $15/M output tokens (OpenAI assumptions).</w:t>
       </w:r>
     </w:p>
     <w:p>
@@ -254,17 +818,681 @@
         <w:t>IV. EXPERIMENTAL METHODOLOGY</w:t>
       </w:r>
     </w:p>
+    <w:tbl>
+      <w:tblPr>
+        <w:tblStyle w:val="TableGrid"/>
+        <w:tblW w:type="auto" w:w="0"/>
+        <w:tblLook w:firstColumn="1" w:firstRow="1" w:lastColumn="0" w:lastRow="0" w:noHBand="0" w:noVBand="1" w:val="04A0"/>
+      </w:tblPr>
+      <w:tblGrid>
+        <w:gridCol w:w="4320"/>
+        <w:gridCol w:w="4320"/>
+      </w:tblGrid>
+      <w:tr>
+        <w:tc>
+          <w:tcPr>
+            <w:tcW w:type="dxa" w:w="4320"/>
+          </w:tcPr>
+          <w:p>
+            <w:r>
+              <w:t>Parameter</w:t>
+            </w:r>
+          </w:p>
+        </w:tc>
+        <w:tc>
+          <w:tcPr>
+            <w:tcW w:type="dxa" w:w="4320"/>
+          </w:tcPr>
+          <w:p>
+            <w:r>
+              <w:t>Value</w:t>
+            </w:r>
+          </w:p>
+        </w:tc>
+      </w:tr>
+      <w:tr>
+        <w:tc>
+          <w:tcPr>
+            <w:tcW w:type="dxa" w:w="4320"/>
+          </w:tcPr>
+          <w:p>
+            <w:r>
+              <w:t>Total Requests</w:t>
+            </w:r>
+          </w:p>
+        </w:tc>
+        <w:tc>
+          <w:tcPr>
+            <w:tcW w:type="dxa" w:w="4320"/>
+          </w:tcPr>
+          <w:p>
+            <w:r>
+              <w:t>100,000</w:t>
+            </w:r>
+          </w:p>
+        </w:tc>
+      </w:tr>
+      <w:tr>
+        <w:tc>
+          <w:tcPr>
+            <w:tcW w:type="dxa" w:w="4320"/>
+          </w:tcPr>
+          <w:p>
+            <w:r>
+              <w:t>Independent Runs</w:t>
+            </w:r>
+          </w:p>
+        </w:tc>
+        <w:tc>
+          <w:tcPr>
+            <w:tcW w:type="dxa" w:w="4320"/>
+          </w:tcPr>
+          <w:p>
+            <w:r>
+              <w:t>30</w:t>
+            </w:r>
+          </w:p>
+        </w:tc>
+      </w:tr>
+      <w:tr>
+        <w:tc>
+          <w:tcPr>
+            <w:tcW w:type="dxa" w:w="4320"/>
+          </w:tcPr>
+          <w:p>
+            <w:r>
+              <w:t>Classification</w:t>
+            </w:r>
+          </w:p>
+        </w:tc>
+        <w:tc>
+          <w:tcPr>
+            <w:tcW w:type="dxa" w:w="4320"/>
+          </w:tcPr>
+          <w:p>
+            <w:r>
+              <w:t>25%</w:t>
+            </w:r>
+          </w:p>
+        </w:tc>
+      </w:tr>
+      <w:tr>
+        <w:tc>
+          <w:tcPr>
+            <w:tcW w:type="dxa" w:w="4320"/>
+          </w:tcPr>
+          <w:p>
+            <w:r>
+              <w:t>Retrieval</w:t>
+            </w:r>
+          </w:p>
+        </w:tc>
+        <w:tc>
+          <w:tcPr>
+            <w:tcW w:type="dxa" w:w="4320"/>
+          </w:tcPr>
+          <w:p>
+            <w:r>
+              <w:t>20%</w:t>
+            </w:r>
+          </w:p>
+        </w:tc>
+      </w:tr>
+      <w:tr>
+        <w:tc>
+          <w:tcPr>
+            <w:tcW w:type="dxa" w:w="4320"/>
+          </w:tcPr>
+          <w:p>
+            <w:r>
+              <w:t>Summarization</w:t>
+            </w:r>
+          </w:p>
+        </w:tc>
+        <w:tc>
+          <w:tcPr>
+            <w:tcW w:type="dxa" w:w="4320"/>
+          </w:tcPr>
+          <w:p>
+            <w:r>
+              <w:t>15%</w:t>
+            </w:r>
+          </w:p>
+        </w:tc>
+      </w:tr>
+      <w:tr>
+        <w:tc>
+          <w:tcPr>
+            <w:tcW w:type="dxa" w:w="4320"/>
+          </w:tcPr>
+          <w:p>
+            <w:r>
+              <w:t>Extraction</w:t>
+            </w:r>
+          </w:p>
+        </w:tc>
+        <w:tc>
+          <w:tcPr>
+            <w:tcW w:type="dxa" w:w="4320"/>
+          </w:tcPr>
+          <w:p>
+            <w:r>
+              <w:t>15%</w:t>
+            </w:r>
+          </w:p>
+        </w:tc>
+      </w:tr>
+      <w:tr>
+        <w:tc>
+          <w:tcPr>
+            <w:tcW w:type="dxa" w:w="4320"/>
+          </w:tcPr>
+          <w:p>
+            <w:r>
+              <w:t>Question Answering</w:t>
+            </w:r>
+          </w:p>
+        </w:tc>
+        <w:tc>
+          <w:tcPr>
+            <w:tcW w:type="dxa" w:w="4320"/>
+          </w:tcPr>
+          <w:p>
+            <w:r>
+              <w:t>15%</w:t>
+            </w:r>
+          </w:p>
+        </w:tc>
+      </w:tr>
+      <w:tr>
+        <w:tc>
+          <w:tcPr>
+            <w:tcW w:type="dxa" w:w="4320"/>
+          </w:tcPr>
+          <w:p>
+            <w:r>
+              <w:t>Reasoning</w:t>
+            </w:r>
+          </w:p>
+        </w:tc>
+        <w:tc>
+          <w:tcPr>
+            <w:tcW w:type="dxa" w:w="4320"/>
+          </w:tcPr>
+          <w:p>
+            <w:r>
+              <w:t>10%</w:t>
+            </w:r>
+          </w:p>
+        </w:tc>
+      </w:tr>
+      <w:tr>
+        <w:tc>
+          <w:tcPr>
+            <w:tcW w:type="dxa" w:w="4320"/>
+          </w:tcPr>
+          <w:p>
+            <w:r>
+              <w:t>Exact Match Queries</w:t>
+            </w:r>
+          </w:p>
+        </w:tc>
+        <w:tc>
+          <w:tcPr>
+            <w:tcW w:type="dxa" w:w="4320"/>
+          </w:tcPr>
+          <w:p>
+            <w:r>
+              <w:t>30%</w:t>
+            </w:r>
+          </w:p>
+        </w:tc>
+      </w:tr>
+      <w:tr>
+        <w:tc>
+          <w:tcPr>
+            <w:tcW w:type="dxa" w:w="4320"/>
+          </w:tcPr>
+          <w:p>
+            <w:r>
+              <w:t>Semantic Variants</w:t>
+            </w:r>
+          </w:p>
+        </w:tc>
+        <w:tc>
+          <w:tcPr>
+            <w:tcW w:type="dxa" w:w="4320"/>
+          </w:tcPr>
+          <w:p>
+            <w:r>
+              <w:t>30%</w:t>
+            </w:r>
+          </w:p>
+        </w:tc>
+      </w:tr>
+      <w:tr>
+        <w:tc>
+          <w:tcPr>
+            <w:tcW w:type="dxa" w:w="4320"/>
+          </w:tcPr>
+          <w:p>
+            <w:r>
+              <w:t>Novel Queries</w:t>
+            </w:r>
+          </w:p>
+        </w:tc>
+        <w:tc>
+          <w:tcPr>
+            <w:tcW w:type="dxa" w:w="4320"/>
+          </w:tcPr>
+          <w:p>
+            <w:r>
+              <w:t>40%</w:t>
+            </w:r>
+          </w:p>
+        </w:tc>
+      </w:tr>
+      <w:tr>
+        <w:tc>
+          <w:tcPr>
+            <w:tcW w:type="dxa" w:w="4320"/>
+          </w:tcPr>
+          <w:p>
+            <w:r>
+              <w:t>Prompt Size (Small 100-500)</w:t>
+            </w:r>
+          </w:p>
+        </w:tc>
+        <w:tc>
+          <w:tcPr>
+            <w:tcW w:type="dxa" w:w="4320"/>
+          </w:tcPr>
+          <w:p>
+            <w:r>
+              <w:t>40%</w:t>
+            </w:r>
+          </w:p>
+        </w:tc>
+      </w:tr>
+      <w:tr>
+        <w:tc>
+          <w:tcPr>
+            <w:tcW w:type="dxa" w:w="4320"/>
+          </w:tcPr>
+          <w:p>
+            <w:r>
+              <w:t>Prompt Size (Medium 500-2000)</w:t>
+            </w:r>
+          </w:p>
+        </w:tc>
+        <w:tc>
+          <w:tcPr>
+            <w:tcW w:type="dxa" w:w="4320"/>
+          </w:tcPr>
+          <w:p>
+            <w:r>
+              <w:t>40%</w:t>
+            </w:r>
+          </w:p>
+        </w:tc>
+      </w:tr>
+      <w:tr>
+        <w:tc>
+          <w:tcPr>
+            <w:tcW w:type="dxa" w:w="4320"/>
+          </w:tcPr>
+          <w:p>
+            <w:r>
+              <w:t>Prompt Size (Large 2000-8000)</w:t>
+            </w:r>
+          </w:p>
+        </w:tc>
+        <w:tc>
+          <w:tcPr>
+            <w:tcW w:type="dxa" w:w="4320"/>
+          </w:tcPr>
+          <w:p>
+            <w:r>
+              <w:t>20%</w:t>
+            </w:r>
+          </w:p>
+        </w:tc>
+      </w:tr>
+      <w:tr>
+        <w:tc>
+          <w:tcPr>
+            <w:tcW w:type="dxa" w:w="4320"/>
+          </w:tcPr>
+          <w:p>
+            <w:r>
+              <w:t>Cache Capacity</w:t>
+            </w:r>
+          </w:p>
+        </w:tc>
+        <w:tc>
+          <w:tcPr>
+            <w:tcW w:type="dxa" w:w="4320"/>
+          </w:tcPr>
+          <w:p>
+            <w:r>
+              <w:t>1,500 entries</w:t>
+            </w:r>
+          </w:p>
+        </w:tc>
+      </w:tr>
+      <w:tr>
+        <w:tc>
+          <w:tcPr>
+            <w:tcW w:type="dxa" w:w="4320"/>
+          </w:tcPr>
+          <w:p>
+            <w:r>
+              <w:t>Semantic Threshold</w:t>
+            </w:r>
+          </w:p>
+        </w:tc>
+        <w:tc>
+          <w:tcPr>
+            <w:tcW w:type="dxa" w:w="4320"/>
+          </w:tcPr>
+          <w:p>
+            <w:r>
+              <w:t>0.90</w:t>
+            </w:r>
+          </w:p>
+        </w:tc>
+      </w:tr>
+      <w:tr>
+        <w:tc>
+          <w:tcPr>
+            <w:tcW w:type="dxa" w:w="4320"/>
+          </w:tcPr>
+          <w:p>
+            <w:r>
+              <w:t>Random Seed</w:t>
+            </w:r>
+          </w:p>
+        </w:tc>
+        <w:tc>
+          <w:tcPr>
+            <w:tcW w:type="dxa" w:w="4320"/>
+          </w:tcPr>
+          <w:p>
+            <w:r>
+              <w:t>42</w:t>
+            </w:r>
+          </w:p>
+        </w:tc>
+      </w:tr>
+    </w:tbl>
+    <w:p>
+      <w:pPr>
+        <w:jc w:val="center"/>
+      </w:pPr>
+      <w:r>
+        <w:rPr>
+          <w:i/>
+        </w:rPr>
+        <w:t>TABLE IV. EXPERIMENTAL CONFIGURATION</w:t>
+      </w:r>
+    </w:p>
+    <w:p/>
     <w:p>
       <w:pPr>
         <w:spacing w:after="120"/>
       </w:pPr>
       <w:r>
-        <w:rPr>
-          <w:b w:val="0"/>
-        </w:rPr>
-        <w:t>We generated 100,000 synthetic enterprise AI requests with workload mix: 25% classification, 20% retrieval, 15% summarization, 15% extraction, 15% question answering, 10% reasoning. Query repetition followed 30% exact match, 30% semantic variants, 40% novel queries. Prompt sizes: 100–500 (40%), 500–2000 (40%), 2000–8000 (20%) tokens. Each method was evaluated over 30 independent runs with randomized request orderings.</w:t>
+        <w:t>Enterprise contexts: security policies, compliance documents, architecture standards, financial procedures, HR policies, IT operations manuals, project knowledge.</w:t>
       </w:r>
     </w:p>
+    <w:tbl>
+      <w:tblPr>
+        <w:tblStyle w:val="TableGrid"/>
+        <w:tblW w:type="auto" w:w="0"/>
+        <w:tblLook w:firstColumn="1" w:firstRow="1" w:lastColumn="0" w:lastRow="0" w:noHBand="0" w:noVBand="1" w:val="04A0"/>
+      </w:tblPr>
+      <w:tblGrid>
+        <w:gridCol w:w="2880"/>
+        <w:gridCol w:w="2880"/>
+        <w:gridCol w:w="2880"/>
+      </w:tblGrid>
+      <w:tr>
+        <w:tc>
+          <w:tcPr>
+            <w:tcW w:type="dxa" w:w="2880"/>
+          </w:tcPr>
+          <w:p>
+            <w:r>
+              <w:t>ID</w:t>
+            </w:r>
+          </w:p>
+        </w:tc>
+        <w:tc>
+          <w:tcPr>
+            <w:tcW w:type="dxa" w:w="2880"/>
+          </w:tcPr>
+          <w:p>
+            <w:r>
+              <w:t>Method</w:t>
+            </w:r>
+          </w:p>
+        </w:tc>
+        <w:tc>
+          <w:tcPr>
+            <w:tcW w:type="dxa" w:w="2880"/>
+          </w:tcPr>
+          <w:p>
+            <w:r>
+              <w:t>Description</w:t>
+            </w:r>
+          </w:p>
+        </w:tc>
+      </w:tr>
+      <w:tr>
+        <w:tc>
+          <w:tcPr>
+            <w:tcW w:type="dxa" w:w="2880"/>
+          </w:tcPr>
+          <w:p>
+            <w:r>
+              <w:t>A</w:t>
+            </w:r>
+          </w:p>
+        </w:tc>
+        <w:tc>
+          <w:tcPr>
+            <w:tcW w:type="dxa" w:w="2880"/>
+          </w:tcPr>
+          <w:p>
+            <w:r>
+              <w:t>LRU</w:t>
+            </w:r>
+          </w:p>
+        </w:tc>
+        <w:tc>
+          <w:tcPr>
+            <w:tcW w:type="dxa" w:w="2880"/>
+          </w:tcPr>
+          <w:p>
+            <w:r>
+              <w:t>Traditional least-recently-used cache</w:t>
+            </w:r>
+          </w:p>
+        </w:tc>
+      </w:tr>
+      <w:tr>
+        <w:tc>
+          <w:tcPr>
+            <w:tcW w:type="dxa" w:w="2880"/>
+          </w:tcPr>
+          <w:p>
+            <w:r>
+              <w:t>B</w:t>
+            </w:r>
+          </w:p>
+        </w:tc>
+        <w:tc>
+          <w:tcPr>
+            <w:tcW w:type="dxa" w:w="2880"/>
+          </w:tcPr>
+          <w:p>
+            <w:r>
+              <w:t>LFU</w:t>
+            </w:r>
+          </w:p>
+        </w:tc>
+        <w:tc>
+          <w:tcPr>
+            <w:tcW w:type="dxa" w:w="2880"/>
+          </w:tcPr>
+          <w:p>
+            <w:r>
+              <w:t>Least-frequently-used cache</w:t>
+            </w:r>
+          </w:p>
+        </w:tc>
+      </w:tr>
+      <w:tr>
+        <w:tc>
+          <w:tcPr>
+            <w:tcW w:type="dxa" w:w="2880"/>
+          </w:tcPr>
+          <w:p>
+            <w:r>
+              <w:t>C</w:t>
+            </w:r>
+          </w:p>
+        </w:tc>
+        <w:tc>
+          <w:tcPr>
+            <w:tcW w:type="dxa" w:w="2880"/>
+          </w:tcPr>
+          <w:p>
+            <w:r>
+              <w:t>Semantic-Only</w:t>
+            </w:r>
+          </w:p>
+        </w:tc>
+        <w:tc>
+          <w:tcPr>
+            <w:tcW w:type="dxa" w:w="2880"/>
+          </w:tcPr>
+          <w:p>
+            <w:r>
+              <w:t>Embedding-based semantic cache</w:t>
+            </w:r>
+          </w:p>
+        </w:tc>
+      </w:tr>
+      <w:tr>
+        <w:tc>
+          <w:tcPr>
+            <w:tcW w:type="dxa" w:w="2880"/>
+          </w:tcPr>
+          <w:p>
+            <w:r>
+              <w:t>D</w:t>
+            </w:r>
+          </w:p>
+        </w:tc>
+        <w:tc>
+          <w:tcPr>
+            <w:tcW w:type="dxa" w:w="2880"/>
+          </w:tcPr>
+          <w:p>
+            <w:r>
+              <w:t>Prompt-Only</w:t>
+            </w:r>
+          </w:p>
+        </w:tc>
+        <w:tc>
+          <w:tcPr>
+            <w:tcW w:type="dxa" w:w="2880"/>
+          </w:tcPr>
+          <w:p>
+            <w:r>
+              <w:t>Prefix-matching prompt cache</w:t>
+            </w:r>
+          </w:p>
+        </w:tc>
+      </w:tr>
+      <w:tr>
+        <w:tc>
+          <w:tcPr>
+            <w:tcW w:type="dxa" w:w="2880"/>
+          </w:tcPr>
+          <w:p>
+            <w:r>
+              <w:t>E</w:t>
+            </w:r>
+          </w:p>
+        </w:tc>
+        <w:tc>
+          <w:tcPr>
+            <w:tcW w:type="dxa" w:w="2880"/>
+          </w:tcPr>
+          <w:p>
+            <w:r>
+              <w:t>No-Optimization</w:t>
+            </w:r>
+          </w:p>
+        </w:tc>
+        <w:tc>
+          <w:tcPr>
+            <w:tcW w:type="dxa" w:w="2880"/>
+          </w:tcPr>
+          <w:p>
+            <w:r>
+              <w:t>Direct inference, no caching</w:t>
+            </w:r>
+          </w:p>
+        </w:tc>
+      </w:tr>
+      <w:tr>
+        <w:tc>
+          <w:tcPr>
+            <w:tcW w:type="dxa" w:w="2880"/>
+          </w:tcPr>
+          <w:p>
+            <w:r>
+              <w:t>—</w:t>
+            </w:r>
+          </w:p>
+        </w:tc>
+        <w:tc>
+          <w:tcPr>
+            <w:tcW w:type="dxa" w:w="2880"/>
+          </w:tcPr>
+          <w:p>
+            <w:r>
+              <w:t>TokenCacheOps</w:t>
+            </w:r>
+          </w:p>
+        </w:tc>
+        <w:tc>
+          <w:tcPr>
+            <w:tcW w:type="dxa" w:w="2880"/>
+          </w:tcPr>
+          <w:p>
+            <w:r>
+              <w:t>Proposed five-tier architecture</w:t>
+            </w:r>
+          </w:p>
+        </w:tc>
+      </w:tr>
+    </w:tbl>
+    <w:p>
+      <w:pPr>
+        <w:jc w:val="center"/>
+      </w:pPr>
+      <w:r>
+        <w:rPr>
+          <w:i/>
+        </w:rPr>
+        <w:t>TABLE V. BASELINE METHODS</w:t>
+      </w:r>
+    </w:p>
+    <w:p/>
     <w:p>
       <w:pPr>
         <w:pStyle w:val="Heading1"/>
@@ -273,6 +1501,1251 @@
         <w:t>V. EXPERIMENTAL RESULTS</w:t>
       </w:r>
     </w:p>
+    <w:tbl>
+      <w:tblPr>
+        <w:tblStyle w:val="TableGrid"/>
+        <w:tblW w:type="auto" w:w="0"/>
+        <w:tblLook w:firstColumn="1" w:firstRow="1" w:lastColumn="0" w:lastRow="0" w:noHBand="0" w:noVBand="1" w:val="04A0"/>
+      </w:tblPr>
+      <w:tblGrid>
+        <w:gridCol w:w="960"/>
+        <w:gridCol w:w="960"/>
+        <w:gridCol w:w="960"/>
+        <w:gridCol w:w="960"/>
+        <w:gridCol w:w="960"/>
+        <w:gridCol w:w="960"/>
+        <w:gridCol w:w="960"/>
+        <w:gridCol w:w="960"/>
+        <w:gridCol w:w="960"/>
+      </w:tblGrid>
+      <w:tr>
+        <w:tc>
+          <w:tcPr>
+            <w:tcW w:type="dxa" w:w="960"/>
+          </w:tcPr>
+          <w:p>
+            <w:r>
+              <w:t>Method</w:t>
+            </w:r>
+          </w:p>
+        </w:tc>
+        <w:tc>
+          <w:tcPr>
+            <w:tcW w:type="dxa" w:w="960"/>
+          </w:tcPr>
+          <w:p>
+            <w:r>
+              <w:t>Hit %</w:t>
+            </w:r>
+          </w:p>
+        </w:tc>
+        <w:tc>
+          <w:tcPr>
+            <w:tcW w:type="dxa" w:w="960"/>
+          </w:tcPr>
+          <w:p>
+            <w:r>
+              <w:t>Sem Hit %</w:t>
+            </w:r>
+          </w:p>
+        </w:tc>
+        <w:tc>
+          <w:tcPr>
+            <w:tcW w:type="dxa" w:w="960"/>
+          </w:tcPr>
+          <w:p>
+            <w:r>
+              <w:t>Token %</w:t>
+            </w:r>
+          </w:p>
+        </w:tc>
+        <w:tc>
+          <w:tcPr>
+            <w:tcW w:type="dxa" w:w="960"/>
+          </w:tcPr>
+          <w:p>
+            <w:r>
+              <w:t>Cost %</w:t>
+            </w:r>
+          </w:p>
+        </w:tc>
+        <w:tc>
+          <w:tcPr>
+            <w:tcW w:type="dxa" w:w="960"/>
+          </w:tcPr>
+          <w:p>
+            <w:r>
+              <w:t>Latency</w:t>
+            </w:r>
+          </w:p>
+        </w:tc>
+        <w:tc>
+          <w:tcPr>
+            <w:tcW w:type="dxa" w:w="960"/>
+          </w:tcPr>
+          <w:p>
+            <w:r>
+              <w:t>Throughput</w:t>
+            </w:r>
+          </w:p>
+        </w:tc>
+        <w:tc>
+          <w:tcPr>
+            <w:tcW w:type="dxa" w:w="960"/>
+          </w:tcPr>
+          <w:p>
+            <w:r>
+              <w:t>CEI</w:t>
+            </w:r>
+          </w:p>
+        </w:tc>
+        <w:tc>
+          <w:tcPr>
+            <w:tcW w:type="dxa" w:w="960"/>
+          </w:tcPr>
+          <w:p>
+            <w:r>
+              <w:t>ROI</w:t>
+            </w:r>
+          </w:p>
+        </w:tc>
+      </w:tr>
+      <w:tr>
+        <w:tc>
+          <w:tcPr>
+            <w:tcW w:type="dxa" w:w="960"/>
+          </w:tcPr>
+          <w:p>
+            <w:r>
+              <w:t>B-A (LRU)</w:t>
+            </w:r>
+          </w:p>
+        </w:tc>
+        <w:tc>
+          <w:tcPr>
+            <w:tcW w:type="dxa" w:w="960"/>
+          </w:tcPr>
+          <w:p>
+            <w:r>
+              <w:t>26.6±0.1</w:t>
+            </w:r>
+          </w:p>
+        </w:tc>
+        <w:tc>
+          <w:tcPr>
+            <w:tcW w:type="dxa" w:w="960"/>
+          </w:tcPr>
+          <w:p>
+            <w:r>
+              <w:t>0.0</w:t>
+            </w:r>
+          </w:p>
+        </w:tc>
+        <w:tc>
+          <w:tcPr>
+            <w:tcW w:type="dxa" w:w="960"/>
+          </w:tcPr>
+          <w:p>
+            <w:r>
+              <w:t>24.1±0.1</w:t>
+            </w:r>
+          </w:p>
+        </w:tc>
+        <w:tc>
+          <w:tcPr>
+            <w:tcW w:type="dxa" w:w="960"/>
+          </w:tcPr>
+          <w:p>
+            <w:r>
+              <w:t>9.3±0.0</w:t>
+            </w:r>
+          </w:p>
+        </w:tc>
+        <w:tc>
+          <w:tcPr>
+            <w:tcW w:type="dxa" w:w="960"/>
+          </w:tcPr>
+          <w:p>
+            <w:r>
+              <w:t>257.3</w:t>
+            </w:r>
+          </w:p>
+        </w:tc>
+        <w:tc>
+          <w:tcPr>
+            <w:tcW w:type="dxa" w:w="960"/>
+          </w:tcPr>
+          <w:p>
+            <w:r>
+              <w:t>3.9</w:t>
+            </w:r>
+          </w:p>
+        </w:tc>
+        <w:tc>
+          <w:tcPr>
+            <w:tcW w:type="dxa" w:w="960"/>
+          </w:tcPr>
+          <w:p>
+            <w:r>
+              <w:t>123.6</w:t>
+            </w:r>
+          </w:p>
+        </w:tc>
+        <w:tc>
+          <w:tcPr>
+            <w:tcW w:type="dxa" w:w="960"/>
+          </w:tcPr>
+          <w:p>
+            <w:r>
+              <w:t>7.4x</w:t>
+            </w:r>
+          </w:p>
+        </w:tc>
+      </w:tr>
+      <w:tr>
+        <w:tc>
+          <w:tcPr>
+            <w:tcW w:type="dxa" w:w="960"/>
+          </w:tcPr>
+          <w:p>
+            <w:r>
+              <w:t>B-B (LFU)</w:t>
+            </w:r>
+          </w:p>
+        </w:tc>
+        <w:tc>
+          <w:tcPr>
+            <w:tcW w:type="dxa" w:w="960"/>
+          </w:tcPr>
+          <w:p>
+            <w:r>
+              <w:t>36.6±0.1</w:t>
+            </w:r>
+          </w:p>
+        </w:tc>
+        <w:tc>
+          <w:tcPr>
+            <w:tcW w:type="dxa" w:w="960"/>
+          </w:tcPr>
+          <w:p>
+            <w:r>
+              <w:t>0.0</w:t>
+            </w:r>
+          </w:p>
+        </w:tc>
+        <w:tc>
+          <w:tcPr>
+            <w:tcW w:type="dxa" w:w="960"/>
+          </w:tcPr>
+          <w:p>
+            <w:r>
+              <w:t>33.5±0.1</w:t>
+            </w:r>
+          </w:p>
+        </w:tc>
+        <w:tc>
+          <w:tcPr>
+            <w:tcW w:type="dxa" w:w="960"/>
+          </w:tcPr>
+          <w:p>
+            <w:r>
+              <w:t>13.0±0.0</w:t>
+            </w:r>
+          </w:p>
+        </w:tc>
+        <w:tc>
+          <w:tcPr>
+            <w:tcW w:type="dxa" w:w="960"/>
+          </w:tcPr>
+          <w:p>
+            <w:r>
+              <w:t>222.3</w:t>
+            </w:r>
+          </w:p>
+        </w:tc>
+        <w:tc>
+          <w:tcPr>
+            <w:tcW w:type="dxa" w:w="960"/>
+          </w:tcPr>
+          <w:p>
+            <w:r>
+              <w:t>4.5</w:t>
+            </w:r>
+          </w:p>
+        </w:tc>
+        <w:tc>
+          <w:tcPr>
+            <w:tcW w:type="dxa" w:w="960"/>
+          </w:tcPr>
+          <w:p>
+            <w:r>
+              <w:t>236.2</w:t>
+            </w:r>
+          </w:p>
+        </w:tc>
+        <w:tc>
+          <w:tcPr>
+            <w:tcW w:type="dxa" w:w="960"/>
+          </w:tcPr>
+          <w:p>
+            <w:r>
+              <w:t>10.6x</w:t>
+            </w:r>
+          </w:p>
+        </w:tc>
+      </w:tr>
+      <w:tr>
+        <w:tc>
+          <w:tcPr>
+            <w:tcW w:type="dxa" w:w="960"/>
+          </w:tcPr>
+          <w:p>
+            <w:r>
+              <w:t>B-C (Semantic)</w:t>
+            </w:r>
+          </w:p>
+        </w:tc>
+        <w:tc>
+          <w:tcPr>
+            <w:tcW w:type="dxa" w:w="960"/>
+          </w:tcPr>
+          <w:p>
+            <w:r>
+              <w:t>38.2±0.1</w:t>
+            </w:r>
+          </w:p>
+        </w:tc>
+        <w:tc>
+          <w:tcPr>
+            <w:tcW w:type="dxa" w:w="960"/>
+          </w:tcPr>
+          <w:p>
+            <w:r>
+              <w:t>25.3</w:t>
+            </w:r>
+          </w:p>
+        </w:tc>
+        <w:tc>
+          <w:tcPr>
+            <w:tcW w:type="dxa" w:w="960"/>
+          </w:tcPr>
+          <w:p>
+            <w:r>
+              <w:t>27.6±0.1</w:t>
+            </w:r>
+          </w:p>
+        </w:tc>
+        <w:tc>
+          <w:tcPr>
+            <w:tcW w:type="dxa" w:w="960"/>
+          </w:tcPr>
+          <w:p>
+            <w:r>
+              <w:t>12.2±0.0</w:t>
+            </w:r>
+          </w:p>
+        </w:tc>
+        <w:tc>
+          <w:tcPr>
+            <w:tcW w:type="dxa" w:w="960"/>
+          </w:tcPr>
+          <w:p>
+            <w:r>
+              <w:t>218.2</w:t>
+            </w:r>
+          </w:p>
+        </w:tc>
+        <w:tc>
+          <w:tcPr>
+            <w:tcW w:type="dxa" w:w="960"/>
+          </w:tcPr>
+          <w:p>
+            <w:r>
+              <w:t>4.6</w:t>
+            </w:r>
+          </w:p>
+        </w:tc>
+        <w:tc>
+          <w:tcPr>
+            <w:tcW w:type="dxa" w:w="960"/>
+          </w:tcPr>
+          <w:p>
+            <w:r>
+              <w:t>203.6</w:t>
+            </w:r>
+          </w:p>
+        </w:tc>
+        <w:tc>
+          <w:tcPr>
+            <w:tcW w:type="dxa" w:w="960"/>
+          </w:tcPr>
+          <w:p>
+            <w:r>
+              <w:t>9.9x</w:t>
+            </w:r>
+          </w:p>
+        </w:tc>
+      </w:tr>
+      <w:tr>
+        <w:tc>
+          <w:tcPr>
+            <w:tcW w:type="dxa" w:w="960"/>
+          </w:tcPr>
+          <w:p>
+            <w:r>
+              <w:t>B-D (Prompt)</w:t>
+            </w:r>
+          </w:p>
+        </w:tc>
+        <w:tc>
+          <w:tcPr>
+            <w:tcW w:type="dxa" w:w="960"/>
+          </w:tcPr>
+          <w:p>
+            <w:r>
+              <w:t>17.4±0.1</w:t>
+            </w:r>
+          </w:p>
+        </w:tc>
+        <w:tc>
+          <w:tcPr>
+            <w:tcW w:type="dxa" w:w="960"/>
+          </w:tcPr>
+          <w:p>
+            <w:r>
+              <w:t>0.0</w:t>
+            </w:r>
+          </w:p>
+        </w:tc>
+        <w:tc>
+          <w:tcPr>
+            <w:tcW w:type="dxa" w:w="960"/>
+          </w:tcPr>
+          <w:p>
+            <w:r>
+              <w:t>8.7±0.1</w:t>
+            </w:r>
+          </w:p>
+        </w:tc>
+        <w:tc>
+          <w:tcPr>
+            <w:tcW w:type="dxa" w:w="960"/>
+          </w:tcPr>
+          <w:p>
+            <w:r>
+              <w:t>4.5±0.0</w:t>
+            </w:r>
+          </w:p>
+        </w:tc>
+        <w:tc>
+          <w:tcPr>
+            <w:tcW w:type="dxa" w:w="960"/>
+          </w:tcPr>
+          <w:p>
+            <w:r>
+              <w:t>289.5</w:t>
+            </w:r>
+          </w:p>
+        </w:tc>
+        <w:tc>
+          <w:tcPr>
+            <w:tcW w:type="dxa" w:w="960"/>
+          </w:tcPr>
+          <w:p>
+            <w:r>
+              <w:t>3.5</w:t>
+            </w:r>
+          </w:p>
+        </w:tc>
+        <w:tc>
+          <w:tcPr>
+            <w:tcW w:type="dxa" w:w="960"/>
+          </w:tcPr>
+          <w:p>
+            <w:r>
+              <w:t>17.1</w:t>
+            </w:r>
+          </w:p>
+        </w:tc>
+        <w:tc>
+          <w:tcPr>
+            <w:tcW w:type="dxa" w:w="960"/>
+          </w:tcPr>
+          <w:p>
+            <w:r>
+              <w:t>3.7x</w:t>
+            </w:r>
+          </w:p>
+        </w:tc>
+      </w:tr>
+      <w:tr>
+        <w:tc>
+          <w:tcPr>
+            <w:tcW w:type="dxa" w:w="960"/>
+          </w:tcPr>
+          <w:p>
+            <w:r>
+              <w:t>B-E (No-Opt)</w:t>
+            </w:r>
+          </w:p>
+        </w:tc>
+        <w:tc>
+          <w:tcPr>
+            <w:tcW w:type="dxa" w:w="960"/>
+          </w:tcPr>
+          <w:p>
+            <w:r>
+              <w:t>0.0±0.0</w:t>
+            </w:r>
+          </w:p>
+        </w:tc>
+        <w:tc>
+          <w:tcPr>
+            <w:tcW w:type="dxa" w:w="960"/>
+          </w:tcPr>
+          <w:p>
+            <w:r>
+              <w:t>0.0</w:t>
+            </w:r>
+          </w:p>
+        </w:tc>
+        <w:tc>
+          <w:tcPr>
+            <w:tcW w:type="dxa" w:w="960"/>
+          </w:tcPr>
+          <w:p>
+            <w:r>
+              <w:t>0.0±0.0</w:t>
+            </w:r>
+          </w:p>
+        </w:tc>
+        <w:tc>
+          <w:tcPr>
+            <w:tcW w:type="dxa" w:w="960"/>
+          </w:tcPr>
+          <w:p>
+            <w:r>
+              <w:t>0.0±0.0</w:t>
+            </w:r>
+          </w:p>
+        </w:tc>
+        <w:tc>
+          <w:tcPr>
+            <w:tcW w:type="dxa" w:w="960"/>
+          </w:tcPr>
+          <w:p>
+            <w:r>
+              <w:t>350.0</w:t>
+            </w:r>
+          </w:p>
+        </w:tc>
+        <w:tc>
+          <w:tcPr>
+            <w:tcW w:type="dxa" w:w="960"/>
+          </w:tcPr>
+          <w:p>
+            <w:r>
+              <w:t>2.9</w:t>
+            </w:r>
+          </w:p>
+        </w:tc>
+        <w:tc>
+          <w:tcPr>
+            <w:tcW w:type="dxa" w:w="960"/>
+          </w:tcPr>
+          <w:p>
+            <w:r>
+              <w:t>0.0</w:t>
+            </w:r>
+          </w:p>
+        </w:tc>
+        <w:tc>
+          <w:tcPr>
+            <w:tcW w:type="dxa" w:w="960"/>
+          </w:tcPr>
+          <w:p>
+            <w:r>
+              <w:t>-1.0x</w:t>
+            </w:r>
+          </w:p>
+        </w:tc>
+      </w:tr>
+      <w:tr>
+        <w:tc>
+          <w:tcPr>
+            <w:tcW w:type="dxa" w:w="960"/>
+          </w:tcPr>
+          <w:p>
+            <w:r>
+              <w:t>TokenCacheOps</w:t>
+            </w:r>
+          </w:p>
+        </w:tc>
+        <w:tc>
+          <w:tcPr>
+            <w:tcW w:type="dxa" w:w="960"/>
+          </w:tcPr>
+          <w:p>
+            <w:r>
+              <w:t>56.4±0.2</w:t>
+            </w:r>
+          </w:p>
+        </w:tc>
+        <w:tc>
+          <w:tcPr>
+            <w:tcW w:type="dxa" w:w="960"/>
+          </w:tcPr>
+          <w:p>
+            <w:r>
+              <w:t>48.0</w:t>
+            </w:r>
+          </w:p>
+        </w:tc>
+        <w:tc>
+          <w:tcPr>
+            <w:tcW w:type="dxa" w:w="960"/>
+          </w:tcPr>
+          <w:p>
+            <w:r>
+              <w:t>38.7±0.3</w:t>
+            </w:r>
+          </w:p>
+        </w:tc>
+        <w:tc>
+          <w:tcPr>
+            <w:tcW w:type="dxa" w:w="960"/>
+          </w:tcPr>
+          <w:p>
+            <w:r>
+              <w:t>45.6±0.1</w:t>
+            </w:r>
+          </w:p>
+        </w:tc>
+        <w:tc>
+          <w:tcPr>
+            <w:tcW w:type="dxa" w:w="960"/>
+          </w:tcPr>
+          <w:p>
+            <w:r>
+              <w:t>52.0</w:t>
+            </w:r>
+          </w:p>
+        </w:tc>
+        <w:tc>
+          <w:tcPr>
+            <w:tcW w:type="dxa" w:w="960"/>
+          </w:tcPr>
+          <w:p>
+            <w:r>
+              <w:t>19.2</w:t>
+            </w:r>
+          </w:p>
+        </w:tc>
+        <w:tc>
+          <w:tcPr>
+            <w:tcW w:type="dxa" w:w="960"/>
+          </w:tcPr>
+          <w:p>
+            <w:r>
+              <w:t>549.2</w:t>
+            </w:r>
+          </w:p>
+        </w:tc>
+        <w:tc>
+          <w:tcPr>
+            <w:tcW w:type="dxa" w:w="960"/>
+          </w:tcPr>
+          <w:p>
+            <w:r>
+              <w:t>52.3x</w:t>
+            </w:r>
+          </w:p>
+        </w:tc>
+      </w:tr>
+    </w:tbl>
+    <w:p>
+      <w:pPr>
+        <w:jc w:val="center"/>
+      </w:pPr>
+      <w:r>
+        <w:rPr>
+          <w:i/>
+        </w:rPr>
+        <w:t>TABLE VI. COMPREHENSIVE PERFORMANCE COMPARISON (30 RUNS)</w:t>
+      </w:r>
+    </w:p>
+    <w:p/>
+    <w:tbl>
+      <w:tblPr>
+        <w:tblStyle w:val="TableGrid"/>
+        <w:tblW w:type="auto" w:w="0"/>
+        <w:tblLook w:firstColumn="1" w:firstRow="1" w:lastColumn="0" w:lastRow="0" w:noHBand="0" w:noVBand="1" w:val="04A0"/>
+      </w:tblPr>
+      <w:tblGrid>
+        <w:gridCol w:w="2160"/>
+        <w:gridCol w:w="2160"/>
+        <w:gridCol w:w="2160"/>
+        <w:gridCol w:w="2160"/>
+      </w:tblGrid>
+      <w:tr>
+        <w:tc>
+          <w:tcPr>
+            <w:tcW w:type="dxa" w:w="2160"/>
+          </w:tcPr>
+          <w:p>
+            <w:r>
+              <w:t>Metric</w:t>
+            </w:r>
+          </w:p>
+        </w:tc>
+        <w:tc>
+          <w:tcPr>
+            <w:tcW w:type="dxa" w:w="2160"/>
+          </w:tcPr>
+          <w:p>
+            <w:r>
+              <w:t>Target</w:t>
+            </w:r>
+          </w:p>
+        </w:tc>
+        <w:tc>
+          <w:tcPr>
+            <w:tcW w:type="dxa" w:w="2160"/>
+          </w:tcPr>
+          <w:p>
+            <w:r>
+              <w:t>Achieved</w:t>
+            </w:r>
+          </w:p>
+        </w:tc>
+        <w:tc>
+          <w:tcPr>
+            <w:tcW w:type="dxa" w:w="2160"/>
+          </w:tcPr>
+          <w:p>
+            <w:r>
+              <w:t>Status</w:t>
+            </w:r>
+          </w:p>
+        </w:tc>
+      </w:tr>
+      <w:tr>
+        <w:tc>
+          <w:tcPr>
+            <w:tcW w:type="dxa" w:w="2160"/>
+          </w:tcPr>
+          <w:p>
+            <w:r>
+              <w:t>Token Reduction</w:t>
+            </w:r>
+          </w:p>
+        </w:tc>
+        <w:tc>
+          <w:tcPr>
+            <w:tcW w:type="dxa" w:w="2160"/>
+          </w:tcPr>
+          <w:p>
+            <w:r>
+              <w:t>30–50%</w:t>
+            </w:r>
+          </w:p>
+        </w:tc>
+        <w:tc>
+          <w:tcPr>
+            <w:tcW w:type="dxa" w:w="2160"/>
+          </w:tcPr>
+          <w:p>
+            <w:r>
+              <w:t>38.7%</w:t>
+            </w:r>
+          </w:p>
+        </w:tc>
+        <w:tc>
+          <w:tcPr>
+            <w:tcW w:type="dxa" w:w="2160"/>
+          </w:tcPr>
+          <w:p>
+            <w:r>
+              <w:t>Pass</w:t>
+            </w:r>
+          </w:p>
+        </w:tc>
+      </w:tr>
+      <w:tr>
+        <w:tc>
+          <w:tcPr>
+            <w:tcW w:type="dxa" w:w="2160"/>
+          </w:tcPr>
+          <w:p>
+            <w:r>
+              <w:t>Cost Reduction</w:t>
+            </w:r>
+          </w:p>
+        </w:tc>
+        <w:tc>
+          <w:tcPr>
+            <w:tcW w:type="dxa" w:w="2160"/>
+          </w:tcPr>
+          <w:p>
+            <w:r>
+              <w:t>20–40%</w:t>
+            </w:r>
+          </w:p>
+        </w:tc>
+        <w:tc>
+          <w:tcPr>
+            <w:tcW w:type="dxa" w:w="2160"/>
+          </w:tcPr>
+          <w:p>
+            <w:r>
+              <w:t>45.6%</w:t>
+            </w:r>
+          </w:p>
+        </w:tc>
+        <w:tc>
+          <w:tcPr>
+            <w:tcW w:type="dxa" w:w="2160"/>
+          </w:tcPr>
+          <w:p>
+            <w:r>
+              <w:t>Pass</w:t>
+            </w:r>
+          </w:p>
+        </w:tc>
+      </w:tr>
+      <w:tr>
+        <w:tc>
+          <w:tcPr>
+            <w:tcW w:type="dxa" w:w="2160"/>
+          </w:tcPr>
+          <w:p>
+            <w:r>
+              <w:t>Latency Reduction</w:t>
+            </w:r>
+          </w:p>
+        </w:tc>
+        <w:tc>
+          <w:tcPr>
+            <w:tcW w:type="dxa" w:w="2160"/>
+          </w:tcPr>
+          <w:p>
+            <w:r>
+              <w:t>15–35%</w:t>
+            </w:r>
+          </w:p>
+        </w:tc>
+        <w:tc>
+          <w:tcPr>
+            <w:tcW w:type="dxa" w:w="2160"/>
+          </w:tcPr>
+          <w:p>
+            <w:r>
+              <w:t>85.1%</w:t>
+            </w:r>
+          </w:p>
+        </w:tc>
+        <w:tc>
+          <w:tcPr>
+            <w:tcW w:type="dxa" w:w="2160"/>
+          </w:tcPr>
+          <w:p>
+            <w:r>
+              <w:t>Pass</w:t>
+            </w:r>
+          </w:p>
+        </w:tc>
+      </w:tr>
+      <w:tr>
+        <w:tc>
+          <w:tcPr>
+            <w:tcW w:type="dxa" w:w="2160"/>
+          </w:tcPr>
+          <w:p>
+            <w:r>
+              <w:t>Cache Hit Improvement</w:t>
+            </w:r>
+          </w:p>
+        </w:tc>
+        <w:tc>
+          <w:tcPr>
+            <w:tcW w:type="dxa" w:w="2160"/>
+          </w:tcPr>
+          <w:p>
+            <w:r>
+              <w:t>25–60%</w:t>
+            </w:r>
+          </w:p>
+        </w:tc>
+        <w:tc>
+          <w:tcPr>
+            <w:tcW w:type="dxa" w:w="2160"/>
+          </w:tcPr>
+          <w:p>
+            <w:r>
+              <w:t>46.9%</w:t>
+            </w:r>
+          </w:p>
+        </w:tc>
+        <w:tc>
+          <w:tcPr>
+            <w:tcW w:type="dxa" w:w="2160"/>
+          </w:tcPr>
+          <w:p>
+            <w:r>
+              <w:t>Pass</w:t>
+            </w:r>
+          </w:p>
+        </w:tc>
+      </w:tr>
+    </w:tbl>
+    <w:p>
+      <w:pPr>
+        <w:jc w:val="center"/>
+      </w:pPr>
+      <w:r>
+        <w:rPr>
+          <w:i/>
+        </w:rPr>
+        <w:t>TABLE VII. TARGET VS. ACHIEVED PERFORMANCE</w:t>
+      </w:r>
+    </w:p>
+    <w:p/>
+    <w:p>
+      <w:r>
+        <w:drawing>
+          <wp:inline xmlns:a="http://schemas.openxmlformats.org/drawingml/2006/main" xmlns:pic="http://schemas.openxmlformats.org/drawingml/2006/picture">
+            <wp:extent cx="5029200" cy="2991068"/>
+            <wp:docPr id="2" name="Picture 2"/>
+            <wp:cNvGraphicFramePr>
+              <a:graphicFrameLocks noChangeAspect="1"/>
+            </wp:cNvGraphicFramePr>
+            <a:graphic>
+              <a:graphicData uri="http://schemas.openxmlformats.org/drawingml/2006/picture">
+                <pic:pic>
+                  <pic:nvPicPr>
+                    <pic:cNvPr id="0" name="figure2_cache_hit_rate.png"/>
+                    <pic:cNvPicPr/>
+                  </pic:nvPicPr>
+                  <pic:blipFill>
+                    <a:blip r:embed="rId10"/>
+                    <a:stretch>
+                      <a:fillRect/>
+                    </a:stretch>
+                  </pic:blipFill>
+                  <pic:spPr>
+                    <a:xfrm>
+                      <a:off x="0" y="0"/>
+                      <a:ext cx="5029200" cy="2991068"/>
+                    </a:xfrm>
+                    <a:prstGeom prst="rect"/>
+                  </pic:spPr>
+                </pic:pic>
+              </a:graphicData>
+            </a:graphic>
+          </wp:inline>
+        </w:drawing>
+      </w:r>
+    </w:p>
+    <w:p>
+      <w:pPr>
+        <w:jc w:val="center"/>
+      </w:pPr>
+      <w:r>
+        <w:rPr>
+          <w:i/>
+        </w:rPr>
+        <w:t>Fig. 2. Cache hit rate comparison across all methods.</w:t>
+      </w:r>
+    </w:p>
+    <w:p/>
+    <w:p>
+      <w:r>
+        <w:drawing>
+          <wp:inline xmlns:a="http://schemas.openxmlformats.org/drawingml/2006/main" xmlns:pic="http://schemas.openxmlformats.org/drawingml/2006/picture">
+            <wp:extent cx="5029200" cy="3016155"/>
+            <wp:docPr id="3" name="Picture 3"/>
+            <wp:cNvGraphicFramePr>
+              <a:graphicFrameLocks noChangeAspect="1"/>
+            </wp:cNvGraphicFramePr>
+            <a:graphic>
+              <a:graphicData uri="http://schemas.openxmlformats.org/drawingml/2006/picture">
+                <pic:pic>
+                  <pic:nvPicPr>
+                    <pic:cNvPr id="0" name="figure3_token_savings.png"/>
+                    <pic:cNvPicPr/>
+                  </pic:nvPicPr>
+                  <pic:blipFill>
+                    <a:blip r:embed="rId11"/>
+                    <a:stretch>
+                      <a:fillRect/>
+                    </a:stretch>
+                  </pic:blipFill>
+                  <pic:spPr>
+                    <a:xfrm>
+                      <a:off x="0" y="0"/>
+                      <a:ext cx="5029200" cy="3016155"/>
+                    </a:xfrm>
+                    <a:prstGeom prst="rect"/>
+                  </pic:spPr>
+                </pic:pic>
+              </a:graphicData>
+            </a:graphic>
+          </wp:inline>
+        </w:drawing>
+      </w:r>
+    </w:p>
+    <w:p>
+      <w:pPr>
+        <w:jc w:val="center"/>
+      </w:pPr>
+      <w:r>
+        <w:rPr>
+          <w:i/>
+        </w:rPr>
+        <w:t>Fig. 3. Token savings comparison.</w:t>
+      </w:r>
+    </w:p>
+    <w:p/>
+    <w:p>
+      <w:r>
+        <w:drawing>
+          <wp:inline xmlns:a="http://schemas.openxmlformats.org/drawingml/2006/main" xmlns:pic="http://schemas.openxmlformats.org/drawingml/2006/picture">
+            <wp:extent cx="5029200" cy="2998862"/>
+            <wp:docPr id="4" name="Picture 4"/>
+            <wp:cNvGraphicFramePr>
+              <a:graphicFrameLocks noChangeAspect="1"/>
+            </wp:cNvGraphicFramePr>
+            <a:graphic>
+              <a:graphicData uri="http://schemas.openxmlformats.org/drawingml/2006/picture">
+                <pic:pic>
+                  <pic:nvPicPr>
+                    <pic:cNvPr id="0" name="figure4_latency.png"/>
+                    <pic:cNvPicPr/>
+                  </pic:nvPicPr>
+                  <pic:blipFill>
+                    <a:blip r:embed="rId12"/>
+                    <a:stretch>
+                      <a:fillRect/>
+                    </a:stretch>
+                  </pic:blipFill>
+                  <pic:spPr>
+                    <a:xfrm>
+                      <a:off x="0" y="0"/>
+                      <a:ext cx="5029200" cy="2998862"/>
+                    </a:xfrm>
+                    <a:prstGeom prst="rect"/>
+                  </pic:spPr>
+                </pic:pic>
+              </a:graphicData>
+            </a:graphic>
+          </wp:inline>
+        </w:drawing>
+      </w:r>
+    </w:p>
+    <w:p>
+      <w:pPr>
+        <w:jc w:val="center"/>
+      </w:pPr>
+      <w:r>
+        <w:rPr>
+          <w:i/>
+        </w:rPr>
+        <w:t>Fig. 4. Response latency distribution (box plots, 30 runs).</w:t>
+      </w:r>
+    </w:p>
+    <w:p/>
+    <w:p>
+      <w:r>
+        <w:drawing>
+          <wp:inline xmlns:a="http://schemas.openxmlformats.org/drawingml/2006/main" xmlns:pic="http://schemas.openxmlformats.org/drawingml/2006/picture">
+            <wp:extent cx="5029200" cy="2997851"/>
+            <wp:docPr id="5" name="Picture 5"/>
+            <wp:cNvGraphicFramePr>
+              <a:graphicFrameLocks noChangeAspect="1"/>
+            </wp:cNvGraphicFramePr>
+            <a:graphic>
+              <a:graphicData uri="http://schemas.openxmlformats.org/drawingml/2006/picture">
+                <pic:pic>
+                  <pic:nvPicPr>
+                    <pic:cNvPr id="0" name="figure5_cost_reduction.png"/>
+                    <pic:cNvPicPr/>
+                  </pic:nvPicPr>
+                  <pic:blipFill>
+                    <a:blip r:embed="rId13"/>
+                    <a:stretch>
+                      <a:fillRect/>
+                    </a:stretch>
+                  </pic:blipFill>
+                  <pic:spPr>
+                    <a:xfrm>
+                      <a:off x="0" y="0"/>
+                      <a:ext cx="5029200" cy="2997851"/>
+                    </a:xfrm>
+                    <a:prstGeom prst="rect"/>
+                  </pic:spPr>
+                </pic:pic>
+              </a:graphicData>
+            </a:graphic>
+          </wp:inline>
+        </w:drawing>
+      </w:r>
+    </w:p>
+    <w:p>
+      <w:pPr>
+        <w:jc w:val="center"/>
+      </w:pPr>
+      <w:r>
+        <w:rPr>
+          <w:i/>
+        </w:rPr>
+        <w:t>Fig. 5. AI inference cost reduction.</w:t>
+      </w:r>
+    </w:p>
+    <w:p/>
+    <w:p>
+      <w:r>
+        <w:drawing>
+          <wp:inline xmlns:a="http://schemas.openxmlformats.org/drawingml/2006/main" xmlns:pic="http://schemas.openxmlformats.org/drawingml/2006/picture">
+            <wp:extent cx="5029200" cy="1672620"/>
+            <wp:docPr id="6" name="Picture 6"/>
+            <wp:cNvGraphicFramePr>
+              <a:graphicFrameLocks noChangeAspect="1"/>
+            </wp:cNvGraphicFramePr>
+            <a:graphic>
+              <a:graphicData uri="http://schemas.openxmlformats.org/drawingml/2006/picture">
+                <pic:pic>
+                  <pic:nvPicPr>
+                    <pic:cNvPr id="0" name="figure6_ablation.png"/>
+                    <pic:cNvPicPr/>
+                  </pic:nvPicPr>
+                  <pic:blipFill>
+                    <a:blip r:embed="rId14"/>
+                    <a:stretch>
+                      <a:fillRect/>
+                    </a:stretch>
+                  </pic:blipFill>
+                  <pic:spPr>
+                    <a:xfrm>
+                      <a:off x="0" y="0"/>
+                      <a:ext cx="5029200" cy="1672620"/>
+                    </a:xfrm>
+                    <a:prstGeom prst="rect"/>
+                  </pic:spPr>
+                </pic:pic>
+              </a:graphicData>
+            </a:graphic>
+          </wp:inline>
+        </w:drawing>
+      </w:r>
+    </w:p>
+    <w:p>
+      <w:pPr>
+        <w:jc w:val="center"/>
+      </w:pPr>
+      <w:r>
+        <w:rPr>
+          <w:i/>
+        </w:rPr>
+        <w:t>Fig. 6. Ablation study: component contribution analysis.</w:t>
+      </w:r>
+    </w:p>
+    <w:p/>
+    <w:p>
+      <w:r>
+        <w:drawing>
+          <wp:inline xmlns:a="http://schemas.openxmlformats.org/drawingml/2006/main" xmlns:pic="http://schemas.openxmlformats.org/drawingml/2006/picture">
+            <wp:extent cx="5029200" cy="2997851"/>
+            <wp:docPr id="7" name="Picture 7"/>
+            <wp:cNvGraphicFramePr>
+              <a:graphicFrameLocks noChangeAspect="1"/>
+            </wp:cNvGraphicFramePr>
+            <a:graphic>
+              <a:graphicData uri="http://schemas.openxmlformats.org/drawingml/2006/picture">
+                <pic:pic>
+                  <pic:nvPicPr>
+                    <pic:cNvPr id="0" name="figure7_roi.png"/>
+                    <pic:cNvPicPr/>
+                  </pic:nvPicPr>
+                  <pic:blipFill>
+                    <a:blip r:embed="rId15"/>
+                    <a:stretch>
+                      <a:fillRect/>
+                    </a:stretch>
+                  </pic:blipFill>
+                  <pic:spPr>
+                    <a:xfrm>
+                      <a:off x="0" y="0"/>
+                      <a:ext cx="5029200" cy="2997851"/>
+                    </a:xfrm>
+                    <a:prstGeom prst="rect"/>
+                  </pic:spPr>
+                </pic:pic>
+              </a:graphicData>
+            </a:graphic>
+          </wp:inline>
+        </w:drawing>
+      </w:r>
+    </w:p>
+    <w:p>
+      <w:pPr>
+        <w:jc w:val="center"/>
+      </w:pPr>
+      <w:r>
+        <w:rPr>
+          <w:i/>
+        </w:rPr>
+        <w:t>Fig. 7. Return on investment (ROI) analysis.</w:t>
+      </w:r>
+    </w:p>
+    <w:p/>
+    <w:p>
+      <w:r>
+        <w:drawing>
+          <wp:inline xmlns:a="http://schemas.openxmlformats.org/drawingml/2006/main" xmlns:pic="http://schemas.openxmlformats.org/drawingml/2006/picture">
+            <wp:extent cx="5029200" cy="1850626"/>
+            <wp:docPr id="8" name="Picture 8"/>
+            <wp:cNvGraphicFramePr>
+              <a:graphicFrameLocks noChangeAspect="1"/>
+            </wp:cNvGraphicFramePr>
+            <a:graphic>
+              <a:graphicData uri="http://schemas.openxmlformats.org/drawingml/2006/picture">
+                <pic:pic>
+                  <pic:nvPicPr>
+                    <pic:cNvPr id="0" name="figure8_retention_heatmap.png"/>
+                    <pic:cNvPicPr/>
+                  </pic:nvPicPr>
+                  <pic:blipFill>
+                    <a:blip r:embed="rId16"/>
+                    <a:stretch>
+                      <a:fillRect/>
+                    </a:stretch>
+                  </pic:blipFill>
+                  <pic:spPr>
+                    <a:xfrm>
+                      <a:off x="0" y="0"/>
+                      <a:ext cx="5029200" cy="1850626"/>
+                    </a:xfrm>
+                    <a:prstGeom prst="rect"/>
+                  </pic:spPr>
+                </pic:pic>
+              </a:graphicData>
+            </a:graphic>
+          </wp:inline>
+        </w:drawing>
+      </w:r>
+    </w:p>
+    <w:p>
+      <w:pPr>
+        <w:jc w:val="center"/>
+      </w:pPr>
+      <w:r>
+        <w:rPr>
+          <w:i/>
+        </w:rPr>
+        <w:t>Fig. 8. Retention score weights and ablation impact heat map.</w:t>
+      </w:r>
+    </w:p>
+    <w:p/>
     <w:tbl>
       <w:tblPr>
         <w:tblStyle w:val="TableGrid"/>
@@ -294,7 +2767,7 @@
           </w:tcPr>
           <w:p>
             <w:r>
-              <w:t>Method</w:t>
+              <w:t>Variant</w:t>
             </w:r>
           </w:p>
         </w:tc>
@@ -304,7 +2777,7 @@
           </w:tcPr>
           <w:p>
             <w:r>
-              <w:t>Hit Ratio (%)</w:t>
+              <w:t>Hit %</w:t>
             </w:r>
           </w:p>
         </w:tc>
@@ -314,7 +2787,7 @@
           </w:tcPr>
           <w:p>
             <w:r>
-              <w:t>Token Red. (%)</w:t>
+              <w:t>Token %</w:t>
             </w:r>
           </w:p>
         </w:tc>
@@ -324,7 +2797,7 @@
           </w:tcPr>
           <w:p>
             <w:r>
-              <w:t>Cost Red. (%)</w:t>
+              <w:t>Cost %</w:t>
             </w:r>
           </w:p>
         </w:tc>
@@ -334,7 +2807,7 @@
           </w:tcPr>
           <w:p>
             <w:r>
-              <w:t>Latency (ms)</w:t>
+              <w:t>Latency</w:t>
             </w:r>
           </w:p>
         </w:tc>
@@ -356,7 +2829,7 @@
           </w:tcPr>
           <w:p>
             <w:r>
-              <w:t>B-A (LRU)</w:t>
+              <w:t>w/o SemanticReuse</w:t>
             </w:r>
           </w:p>
         </w:tc>
@@ -366,7 +2839,7 @@
           </w:tcPr>
           <w:p>
             <w:r>
-              <w:t>26.6</w:t>
+              <w:t>55.6±0.2</w:t>
             </w:r>
           </w:p>
         </w:tc>
@@ -376,7 +2849,7 @@
           </w:tcPr>
           <w:p>
             <w:r>
-              <w:t>24.1</w:t>
+              <w:t>37.8</w:t>
             </w:r>
           </w:p>
         </w:tc>
@@ -386,7 +2859,7 @@
           </w:tcPr>
           <w:p>
             <w:r>
-              <w:t>9.3</w:t>
+              <w:t>45.8</w:t>
             </w:r>
           </w:p>
         </w:tc>
@@ -396,7 +2869,7 @@
           </w:tcPr>
           <w:p>
             <w:r>
-              <w:t>257.3</w:t>
+              <w:t>53.0</w:t>
             </w:r>
           </w:p>
         </w:tc>
@@ -406,7 +2879,7 @@
           </w:tcPr>
           <w:p>
             <w:r>
-              <w:t>7.4x</w:t>
+              <w:t>52.5x</w:t>
             </w:r>
           </w:p>
         </w:tc>
@@ -418,7 +2891,7 @@
           </w:tcPr>
           <w:p>
             <w:r>
-              <w:t>B-B (LFU)</w:t>
+              <w:t>w/o BusinessImportance</w:t>
             </w:r>
           </w:p>
         </w:tc>
@@ -428,7 +2901,7 @@
           </w:tcPr>
           <w:p>
             <w:r>
-              <w:t>36.6</w:t>
+              <w:t>56.2±0.3</w:t>
             </w:r>
           </w:p>
         </w:tc>
@@ -438,7 +2911,7 @@
           </w:tcPr>
           <w:p>
             <w:r>
-              <w:t>33.5</w:t>
+              <w:t>38.5</w:t>
             </w:r>
           </w:p>
         </w:tc>
@@ -448,7 +2921,7 @@
           </w:tcPr>
           <w:p>
             <w:r>
-              <w:t>13.0</w:t>
+              <w:t>45.7</w:t>
             </w:r>
           </w:p>
         </w:tc>
@@ -458,7 +2931,7 @@
           </w:tcPr>
           <w:p>
             <w:r>
-              <w:t>222.3</w:t>
+              <w:t>52.3</w:t>
             </w:r>
           </w:p>
         </w:tc>
@@ -468,7 +2941,7 @@
           </w:tcPr>
           <w:p>
             <w:r>
-              <w:t>10.6x</w:t>
+              <w:t>52.3x</w:t>
             </w:r>
           </w:p>
         </w:tc>
@@ -480,7 +2953,7 @@
           </w:tcPr>
           <w:p>
             <w:r>
-              <w:t>B-C (Semantic)</w:t>
+              <w:t>w/o InfluenceRank</w:t>
             </w:r>
           </w:p>
         </w:tc>
@@ -490,7 +2963,7 @@
           </w:tcPr>
           <w:p>
             <w:r>
-              <w:t>38.2</w:t>
+              <w:t>56.4±0.2</w:t>
             </w:r>
           </w:p>
         </w:tc>
@@ -500,7 +2973,7 @@
           </w:tcPr>
           <w:p>
             <w:r>
-              <w:t>27.6</w:t>
+              <w:t>38.7</w:t>
             </w:r>
           </w:p>
         </w:tc>
@@ -510,7 +2983,7 @@
           </w:tcPr>
           <w:p>
             <w:r>
-              <w:t>12.2</w:t>
+              <w:t>45.6</w:t>
             </w:r>
           </w:p>
         </w:tc>
@@ -520,7 +2993,7 @@
           </w:tcPr>
           <w:p>
             <w:r>
-              <w:t>218.2</w:t>
+              <w:t>52.0</w:t>
             </w:r>
           </w:p>
         </w:tc>
@@ -530,7 +3003,7 @@
           </w:tcPr>
           <w:p>
             <w:r>
-              <w:t>9.9x</w:t>
+              <w:t>52.3x</w:t>
             </w:r>
           </w:p>
         </w:tc>
@@ -542,7 +3015,7 @@
           </w:tcPr>
           <w:p>
             <w:r>
-              <w:t>B-D (Prompt)</w:t>
+              <w:t>w/o PenetrationFactor</w:t>
             </w:r>
           </w:p>
         </w:tc>
@@ -552,7 +3025,7 @@
           </w:tcPr>
           <w:p>
             <w:r>
-              <w:t>17.4</w:t>
+              <w:t>56.4±0.2</w:t>
             </w:r>
           </w:p>
         </w:tc>
@@ -562,7 +3035,7 @@
           </w:tcPr>
           <w:p>
             <w:r>
-              <w:t>8.7</w:t>
+              <w:t>38.5</w:t>
             </w:r>
           </w:p>
         </w:tc>
@@ -572,7 +3045,7 @@
           </w:tcPr>
           <w:p>
             <w:r>
-              <w:t>4.5</w:t>
+              <w:t>45.6</w:t>
             </w:r>
           </w:p>
         </w:tc>
@@ -582,7 +3055,7 @@
           </w:tcPr>
           <w:p>
             <w:r>
-              <w:t>289.5</w:t>
+              <w:t>52.1</w:t>
             </w:r>
           </w:p>
         </w:tc>
@@ -592,7 +3065,7 @@
           </w:tcPr>
           <w:p>
             <w:r>
-              <w:t>3.7x</w:t>
+              <w:t>52.3x</w:t>
             </w:r>
           </w:p>
         </w:tc>
@@ -604,7 +3077,7 @@
           </w:tcPr>
           <w:p>
             <w:r>
-              <w:t>B-E (No-Opt)</w:t>
+              <w:t>Full TokenCacheOps</w:t>
             </w:r>
           </w:p>
         </w:tc>
@@ -614,69 +3087,7 @@
           </w:tcPr>
           <w:p>
             <w:r>
-              <w:t>0.0</w:t>
-            </w:r>
-          </w:p>
-        </w:tc>
-        <w:tc>
-          <w:tcPr>
-            <w:tcW w:type="dxa" w:w="1440"/>
-          </w:tcPr>
-          <w:p>
-            <w:r>
-              <w:t>0.0</w:t>
-            </w:r>
-          </w:p>
-        </w:tc>
-        <w:tc>
-          <w:tcPr>
-            <w:tcW w:type="dxa" w:w="1440"/>
-          </w:tcPr>
-          <w:p>
-            <w:r>
-              <w:t>0.0</w:t>
-            </w:r>
-          </w:p>
-        </w:tc>
-        <w:tc>
-          <w:tcPr>
-            <w:tcW w:type="dxa" w:w="1440"/>
-          </w:tcPr>
-          <w:p>
-            <w:r>
-              <w:t>350.0</w:t>
-            </w:r>
-          </w:p>
-        </w:tc>
-        <w:tc>
-          <w:tcPr>
-            <w:tcW w:type="dxa" w:w="1440"/>
-          </w:tcPr>
-          <w:p>
-            <w:r>
-              <w:t>-1.0x</w:t>
-            </w:r>
-          </w:p>
-        </w:tc>
-      </w:tr>
-      <w:tr>
-        <w:tc>
-          <w:tcPr>
-            <w:tcW w:type="dxa" w:w="1440"/>
-          </w:tcPr>
-          <w:p>
-            <w:r>
-              <w:t>TokenCacheOps</w:t>
-            </w:r>
-          </w:p>
-        </w:tc>
-        <w:tc>
-          <w:tcPr>
-            <w:tcW w:type="dxa" w:w="1440"/>
-          </w:tcPr>
-          <w:p>
-            <w:r>
-              <w:t>56.4</w:t>
+              <w:t>56.4±0.2</w:t>
             </w:r>
           </w:p>
         </w:tc>
@@ -730,326 +3141,16 @@
         <w:rPr>
           <w:i/>
         </w:rPr>
-        <w:t>TABLE I. PERFORMANCE COMPARISON (MEAN OVER 30 RUNS)</w:t>
+        <w:t>TABLE VIII. ABLATION STUDY RESULTS</w:t>
       </w:r>
     </w:p>
+    <w:p/>
     <w:p>
       <w:pPr>
-        <w:spacing w:after="120"/>
+        <w:pStyle w:val="Heading2"/>
       </w:pPr>
       <w:r>
-        <w:rPr>
-          <w:b w:val="0"/>
-        </w:rPr>
-        <w:t>TokenCacheOps achieved 56.4% ± 0.2% cache hit ratio (95% CI: [56.3%, 56.4%]), representing a 46.9% relative improvement over the best baseline (38.4%).</w:t>
-      </w:r>
-    </w:p>
-    <w:p>
-      <w:r>
-        <w:drawing>
-          <wp:inline xmlns:a="http://schemas.openxmlformats.org/drawingml/2006/main" xmlns:pic="http://schemas.openxmlformats.org/drawingml/2006/picture">
-            <wp:extent cx="4572000" cy="2719153"/>
-            <wp:docPr id="2" name="Picture 2"/>
-            <wp:cNvGraphicFramePr>
-              <a:graphicFrameLocks noChangeAspect="1"/>
-            </wp:cNvGraphicFramePr>
-            <a:graphic>
-              <a:graphicData uri="http://schemas.openxmlformats.org/drawingml/2006/picture">
-                <pic:pic>
-                  <pic:nvPicPr>
-                    <pic:cNvPr id="0" name="figure2_cache_hit_rate.png"/>
-                    <pic:cNvPicPr/>
-                  </pic:nvPicPr>
-                  <pic:blipFill>
-                    <a:blip r:embed="rId10"/>
-                    <a:stretch>
-                      <a:fillRect/>
-                    </a:stretch>
-                  </pic:blipFill>
-                  <pic:spPr>
-                    <a:xfrm>
-                      <a:off x="0" y="0"/>
-                      <a:ext cx="4572000" cy="2719153"/>
-                    </a:xfrm>
-                    <a:prstGeom prst="rect"/>
-                  </pic:spPr>
-                </pic:pic>
-              </a:graphicData>
-            </a:graphic>
-          </wp:inline>
-        </w:drawing>
-      </w:r>
-    </w:p>
-    <w:p>
-      <w:pPr>
-        <w:jc w:val="center"/>
-      </w:pPr>
-      <w:r>
-        <w:t>Fig. 2. Cache hit rate comparison across methods.</w:t>
-      </w:r>
-    </w:p>
-    <w:p>
-      <w:r>
-        <w:drawing>
-          <wp:inline xmlns:a="http://schemas.openxmlformats.org/drawingml/2006/main" xmlns:pic="http://schemas.openxmlformats.org/drawingml/2006/picture">
-            <wp:extent cx="4572000" cy="2741959"/>
-            <wp:docPr id="3" name="Picture 3"/>
-            <wp:cNvGraphicFramePr>
-              <a:graphicFrameLocks noChangeAspect="1"/>
-            </wp:cNvGraphicFramePr>
-            <a:graphic>
-              <a:graphicData uri="http://schemas.openxmlformats.org/drawingml/2006/picture">
-                <pic:pic>
-                  <pic:nvPicPr>
-                    <pic:cNvPr id="0" name="figure3_token_savings.png"/>
-                    <pic:cNvPicPr/>
-                  </pic:nvPicPr>
-                  <pic:blipFill>
-                    <a:blip r:embed="rId11"/>
-                    <a:stretch>
-                      <a:fillRect/>
-                    </a:stretch>
-                  </pic:blipFill>
-                  <pic:spPr>
-                    <a:xfrm>
-                      <a:off x="0" y="0"/>
-                      <a:ext cx="4572000" cy="2741959"/>
-                    </a:xfrm>
-                    <a:prstGeom prst="rect"/>
-                  </pic:spPr>
-                </pic:pic>
-              </a:graphicData>
-            </a:graphic>
-          </wp:inline>
-        </w:drawing>
-      </w:r>
-    </w:p>
-    <w:p>
-      <w:pPr>
-        <w:jc w:val="center"/>
-      </w:pPr>
-      <w:r>
-        <w:t>Fig. 3. Token savings comparison.</w:t>
-      </w:r>
-    </w:p>
-    <w:p>
-      <w:r>
-        <w:drawing>
-          <wp:inline xmlns:a="http://schemas.openxmlformats.org/drawingml/2006/main" xmlns:pic="http://schemas.openxmlformats.org/drawingml/2006/picture">
-            <wp:extent cx="4572000" cy="2726238"/>
-            <wp:docPr id="4" name="Picture 4"/>
-            <wp:cNvGraphicFramePr>
-              <a:graphicFrameLocks noChangeAspect="1"/>
-            </wp:cNvGraphicFramePr>
-            <a:graphic>
-              <a:graphicData uri="http://schemas.openxmlformats.org/drawingml/2006/picture">
-                <pic:pic>
-                  <pic:nvPicPr>
-                    <pic:cNvPr id="0" name="figure4_latency.png"/>
-                    <pic:cNvPicPr/>
-                  </pic:nvPicPr>
-                  <pic:blipFill>
-                    <a:blip r:embed="rId12"/>
-                    <a:stretch>
-                      <a:fillRect/>
-                    </a:stretch>
-                  </pic:blipFill>
-                  <pic:spPr>
-                    <a:xfrm>
-                      <a:off x="0" y="0"/>
-                      <a:ext cx="4572000" cy="2726238"/>
-                    </a:xfrm>
-                    <a:prstGeom prst="rect"/>
-                  </pic:spPr>
-                </pic:pic>
-              </a:graphicData>
-            </a:graphic>
-          </wp:inline>
-        </w:drawing>
-      </w:r>
-    </w:p>
-    <w:p>
-      <w:pPr>
-        <w:jc w:val="center"/>
-      </w:pPr>
-      <w:r>
-        <w:t>Fig. 4. Response latency distribution.</w:t>
-      </w:r>
-    </w:p>
-    <w:p>
-      <w:r>
-        <w:drawing>
-          <wp:inline xmlns:a="http://schemas.openxmlformats.org/drawingml/2006/main" xmlns:pic="http://schemas.openxmlformats.org/drawingml/2006/picture">
-            <wp:extent cx="4572000" cy="2725319"/>
-            <wp:docPr id="5" name="Picture 5"/>
-            <wp:cNvGraphicFramePr>
-              <a:graphicFrameLocks noChangeAspect="1"/>
-            </wp:cNvGraphicFramePr>
-            <a:graphic>
-              <a:graphicData uri="http://schemas.openxmlformats.org/drawingml/2006/picture">
-                <pic:pic>
-                  <pic:nvPicPr>
-                    <pic:cNvPr id="0" name="figure5_cost_reduction.png"/>
-                    <pic:cNvPicPr/>
-                  </pic:nvPicPr>
-                  <pic:blipFill>
-                    <a:blip r:embed="rId13"/>
-                    <a:stretch>
-                      <a:fillRect/>
-                    </a:stretch>
-                  </pic:blipFill>
-                  <pic:spPr>
-                    <a:xfrm>
-                      <a:off x="0" y="0"/>
-                      <a:ext cx="4572000" cy="2725319"/>
-                    </a:xfrm>
-                    <a:prstGeom prst="rect"/>
-                  </pic:spPr>
-                </pic:pic>
-              </a:graphicData>
-            </a:graphic>
-          </wp:inline>
-        </w:drawing>
-      </w:r>
-    </w:p>
-    <w:p>
-      <w:pPr>
-        <w:jc w:val="center"/>
-      </w:pPr>
-      <w:r>
-        <w:t>Fig. 5. AI inference cost reduction.</w:t>
-      </w:r>
-    </w:p>
-    <w:p>
-      <w:r>
-        <w:drawing>
-          <wp:inline xmlns:a="http://schemas.openxmlformats.org/drawingml/2006/main" xmlns:pic="http://schemas.openxmlformats.org/drawingml/2006/picture">
-            <wp:extent cx="4572000" cy="1520564"/>
-            <wp:docPr id="6" name="Picture 6"/>
-            <wp:cNvGraphicFramePr>
-              <a:graphicFrameLocks noChangeAspect="1"/>
-            </wp:cNvGraphicFramePr>
-            <a:graphic>
-              <a:graphicData uri="http://schemas.openxmlformats.org/drawingml/2006/picture">
-                <pic:pic>
-                  <pic:nvPicPr>
-                    <pic:cNvPr id="0" name="figure6_ablation.png"/>
-                    <pic:cNvPicPr/>
-                  </pic:nvPicPr>
-                  <pic:blipFill>
-                    <a:blip r:embed="rId14"/>
-                    <a:stretch>
-                      <a:fillRect/>
-                    </a:stretch>
-                  </pic:blipFill>
-                  <pic:spPr>
-                    <a:xfrm>
-                      <a:off x="0" y="0"/>
-                      <a:ext cx="4572000" cy="1520564"/>
-                    </a:xfrm>
-                    <a:prstGeom prst="rect"/>
-                  </pic:spPr>
-                </pic:pic>
-              </a:graphicData>
-            </a:graphic>
-          </wp:inline>
-        </w:drawing>
-      </w:r>
-    </w:p>
-    <w:p>
-      <w:pPr>
-        <w:jc w:val="center"/>
-      </w:pPr>
-      <w:r>
-        <w:t>Fig. 6. Ablation study results.</w:t>
-      </w:r>
-    </w:p>
-    <w:p>
-      <w:r>
-        <w:drawing>
-          <wp:inline xmlns:a="http://schemas.openxmlformats.org/drawingml/2006/main" xmlns:pic="http://schemas.openxmlformats.org/drawingml/2006/picture">
-            <wp:extent cx="4572000" cy="2725319"/>
-            <wp:docPr id="7" name="Picture 7"/>
-            <wp:cNvGraphicFramePr>
-              <a:graphicFrameLocks noChangeAspect="1"/>
-            </wp:cNvGraphicFramePr>
-            <a:graphic>
-              <a:graphicData uri="http://schemas.openxmlformats.org/drawingml/2006/picture">
-                <pic:pic>
-                  <pic:nvPicPr>
-                    <pic:cNvPr id="0" name="figure7_roi.png"/>
-                    <pic:cNvPicPr/>
-                  </pic:nvPicPr>
-                  <pic:blipFill>
-                    <a:blip r:embed="rId15"/>
-                    <a:stretch>
-                      <a:fillRect/>
-                    </a:stretch>
-                  </pic:blipFill>
-                  <pic:spPr>
-                    <a:xfrm>
-                      <a:off x="0" y="0"/>
-                      <a:ext cx="4572000" cy="2725319"/>
-                    </a:xfrm>
-                    <a:prstGeom prst="rect"/>
-                  </pic:spPr>
-                </pic:pic>
-              </a:graphicData>
-            </a:graphic>
-          </wp:inline>
-        </w:drawing>
-      </w:r>
-    </w:p>
-    <w:p>
-      <w:pPr>
-        <w:jc w:val="center"/>
-      </w:pPr>
-      <w:r>
-        <w:t>Fig. 7. Return on investment analysis.</w:t>
-      </w:r>
-    </w:p>
-    <w:p>
-      <w:r>
-        <w:drawing>
-          <wp:inline xmlns:a="http://schemas.openxmlformats.org/drawingml/2006/main" xmlns:pic="http://schemas.openxmlformats.org/drawingml/2006/picture">
-            <wp:extent cx="4572000" cy="1682387"/>
-            <wp:docPr id="8" name="Picture 8"/>
-            <wp:cNvGraphicFramePr>
-              <a:graphicFrameLocks noChangeAspect="1"/>
-            </wp:cNvGraphicFramePr>
-            <a:graphic>
-              <a:graphicData uri="http://schemas.openxmlformats.org/drawingml/2006/picture">
-                <pic:pic>
-                  <pic:nvPicPr>
-                    <pic:cNvPr id="0" name="figure8_retention_heatmap.png"/>
-                    <pic:cNvPicPr/>
-                  </pic:nvPicPr>
-                  <pic:blipFill>
-                    <a:blip r:embed="rId16"/>
-                    <a:stretch>
-                      <a:fillRect/>
-                    </a:stretch>
-                  </pic:blipFill>
-                  <pic:spPr>
-                    <a:xfrm>
-                      <a:off x="0" y="0"/>
-                      <a:ext cx="4572000" cy="1682387"/>
-                    </a:xfrm>
-                    <a:prstGeom prst="rect"/>
-                  </pic:spPr>
-                </pic:pic>
-              </a:graphicData>
-            </a:graphic>
-          </wp:inline>
-        </w:drawing>
-      </w:r>
-    </w:p>
-    <w:p>
-      <w:pPr>
-        <w:jc w:val="center"/>
-      </w:pPr>
-      <w:r>
-        <w:t>Fig. 8. Retention score weight and ablation heat map.</w:t>
+        <w:t>A. Statistical Validation</w:t>
       </w:r>
     </w:p>
     <w:tbl>
@@ -1071,7 +3172,7 @@
           </w:tcPr>
           <w:p>
             <w:r>
-              <w:t>Variant</w:t>
+              <w:t>Comparison</w:t>
             </w:r>
           </w:p>
         </w:tc>
@@ -1081,7 +3182,7 @@
           </w:tcPr>
           <w:p>
             <w:r>
-              <w:t>Hit Ratio (%)</w:t>
+              <w:t>t-statistic</w:t>
             </w:r>
           </w:p>
         </w:tc>
@@ -1091,7 +3192,7 @@
           </w:tcPr>
           <w:p>
             <w:r>
-              <w:t>Token Red. (%)</w:t>
+              <w:t>p-value</w:t>
             </w:r>
           </w:p>
         </w:tc>
@@ -1101,7 +3202,7 @@
           </w:tcPr>
           <w:p>
             <w:r>
-              <w:t>Cost Red. (%)</w:t>
+              <w:t>Cohen's d</w:t>
             </w:r>
           </w:p>
         </w:tc>
@@ -1113,7 +3214,7 @@
           </w:tcPr>
           <w:p>
             <w:r>
-              <w:t>w/o SemanticReuse</w:t>
+              <w:t>TokenCacheOps vs B-A (LRU)</w:t>
             </w:r>
           </w:p>
         </w:tc>
@@ -1123,7 +3224,7 @@
           </w:tcPr>
           <w:p>
             <w:r>
-              <w:t>55.6</w:t>
+              <w:t>810.4</w:t>
             </w:r>
           </w:p>
         </w:tc>
@@ -1133,7 +3234,7 @@
           </w:tcPr>
           <w:p>
             <w:r>
-              <w:t>37.8</w:t>
+              <w:t>9.03e-80</w:t>
             </w:r>
           </w:p>
         </w:tc>
@@ -1143,7 +3244,7 @@
           </w:tcPr>
           <w:p>
             <w:r>
-              <w:t>45.8</w:t>
+              <w:t>209.2</w:t>
             </w:r>
           </w:p>
         </w:tc>
@@ -1155,7 +3256,7 @@
           </w:tcPr>
           <w:p>
             <w:r>
-              <w:t>w/o BusinessImportance</w:t>
+              <w:t>TokenCacheOps vs B-B (LFU)</w:t>
             </w:r>
           </w:p>
         </w:tc>
@@ -1165,7 +3266,7 @@
           </w:tcPr>
           <w:p>
             <w:r>
-              <w:t>56.2</w:t>
+              <w:t>520.5</w:t>
             </w:r>
           </w:p>
         </w:tc>
@@ -1175,7 +3276,7 @@
           </w:tcPr>
           <w:p>
             <w:r>
-              <w:t>38.5</w:t>
+              <w:t>1.33e-79</w:t>
             </w:r>
           </w:p>
         </w:tc>
@@ -1185,7 +3286,7 @@
           </w:tcPr>
           <w:p>
             <w:r>
-              <w:t>45.7</w:t>
+              <w:t>134.4</w:t>
             </w:r>
           </w:p>
         </w:tc>
@@ -1197,7 +3298,7 @@
           </w:tcPr>
           <w:p>
             <w:r>
-              <w:t>w/o InfluenceRank</w:t>
+              <w:t>TokenCacheOps vs B-C (Semantic)</w:t>
             </w:r>
           </w:p>
         </w:tc>
@@ -1207,7 +3308,7 @@
           </w:tcPr>
           <w:p>
             <w:r>
-              <w:t>56.4</w:t>
+              <w:t>487.8</w:t>
             </w:r>
           </w:p>
         </w:tc>
@@ -1217,7 +3318,7 @@
           </w:tcPr>
           <w:p>
             <w:r>
-              <w:t>38.7</w:t>
+              <w:t>2.45e-74</w:t>
             </w:r>
           </w:p>
         </w:tc>
@@ -1227,7 +3328,7 @@
           </w:tcPr>
           <w:p>
             <w:r>
-              <w:t>45.6</w:t>
+              <w:t>125.9</w:t>
             </w:r>
           </w:p>
         </w:tc>
@@ -1239,7 +3340,7 @@
           </w:tcPr>
           <w:p>
             <w:r>
-              <w:t>w/o PenetrationFactor</w:t>
+              <w:t>TokenCacheOps vs B-D (Prompt)</w:t>
             </w:r>
           </w:p>
         </w:tc>
@@ -1249,7 +3350,7 @@
           </w:tcPr>
           <w:p>
             <w:r>
-              <w:t>56.4</w:t>
+              <w:t>1091.9</w:t>
             </w:r>
           </w:p>
         </w:tc>
@@ -1259,7 +3360,7 @@
           </w:tcPr>
           <w:p>
             <w:r>
-              <w:t>38.5</w:t>
+              <w:t>5.15e-77</w:t>
             </w:r>
           </w:p>
         </w:tc>
@@ -1269,7 +3370,7 @@
           </w:tcPr>
           <w:p>
             <w:r>
-              <w:t>45.6</w:t>
+              <w:t>281.9</w:t>
             </w:r>
           </w:p>
         </w:tc>
@@ -1281,7 +3382,7 @@
           </w:tcPr>
           <w:p>
             <w:r>
-              <w:t>Full TokenCacheOps</w:t>
+              <w:t>TokenCacheOps vs B-E (No-Opt)</w:t>
             </w:r>
           </w:p>
         </w:tc>
@@ -1291,7 +3392,7 @@
           </w:tcPr>
           <w:p>
             <w:r>
-              <w:t>56.4</w:t>
+              <w:t>1635.9</w:t>
             </w:r>
           </w:p>
         </w:tc>
@@ -1301,7 +3402,7 @@
           </w:tcPr>
           <w:p>
             <w:r>
-              <w:t>38.7</w:t>
+              <w:t>1.49e-73</w:t>
             </w:r>
           </w:p>
         </w:tc>
@@ -1311,7 +3412,7 @@
           </w:tcPr>
           <w:p>
             <w:r>
-              <w:t>45.6</w:t>
+              <w:t>422.4</w:t>
             </w:r>
           </w:p>
         </w:tc>
@@ -1325,7 +3426,24 @@
         <w:rPr>
           <w:i/>
         </w:rPr>
-        <w:t>TABLE II. ABLATION STUDY RESULTS</w:t>
+        <w:t>TABLE IX. WELCH'S T-TEST VS. TOKENCACHEOPS (CACHE HIT RATIO)</w:t>
+      </w:r>
+    </w:p>
+    <w:p/>
+    <w:p>
+      <w:pPr>
+        <w:spacing w:after="120"/>
+      </w:pPr>
+      <w:r>
+        <w:t>One-way ANOVA: F(5,174)=1193523, p&lt;0.001.</w:t>
+      </w:r>
+    </w:p>
+    <w:p>
+      <w:pPr>
+        <w:spacing w:after="120"/>
+      </w:pPr>
+      <w:r>
+        <w:t>Context efficiency: 0.325. Retrieval efficiency: 0.492. Semantic hit ratio: 48.0%.</w:t>
       </w:r>
     </w:p>
     <w:p>
@@ -1341,10 +3459,7 @@
         <w:spacing w:after="120"/>
       </w:pPr>
       <w:r>
-        <w:rPr>
-          <w:b w:val="0"/>
-        </w:rPr>
-        <w:t>TokenCacheOps outperforms baselines through synergistic integration of tiered retention, semantic reuse, and model routing. The five-tier architecture resolves the tension between cache capacity and hit ratio by preserving high-retention-score entries in the Archive tier rather than evicting them. Semantic reuse scoring contributes −0.8 percentage points to hit ratio when ablated. At enterprise scale, the 38.7% token reduction translates to approximately $23,000 monthly savings for organizations processing 10 million requests.</w:t>
+        <w:t>TokenCacheOps outperforms baselines via tiered retention, semantic reuse, and model routing synergy. The five-tier architecture preserves high-value entries. Semantic reuse ablation shows −0.8pp hit ratio impact. At 10M monthly requests, 38.7% token reduction saves ~$23,000/month at stated pricing.</w:t>
       </w:r>
     </w:p>
     <w:p>
@@ -1360,10 +3475,7 @@
         <w:spacing w:after="120"/>
       </w:pPr>
       <w:r>
-        <w:rPr>
-          <w:b w:val="0"/>
-        </w:rPr>
-        <w:t>Limitations include: (1) synthetic workload generation may not capture all production traffic patterns; (2) fixed OpenAI pricing and embedding model assumptions; (3) single-node cache without distributed coherence; (4) simulation-based evaluation without live LLM inference.</w:t>
+        <w:t>Synthetic workloads; fixed pricing; single-node cache (1,500 entries); simulation without live LLM inference; no distributed coherence.</w:t>
       </w:r>
     </w:p>
     <w:p>
@@ -1379,10 +3491,7 @@
         <w:spacing w:after="120"/>
       </w:pPr>
       <w:r>
-        <w:rPr>
-          <w:b w:val="0"/>
-        </w:rPr>
-        <w:t>Future directions include reinforcement-learning retention weight optimization, adaptive weighting for temporal workload shifts, multi-agent memory caching, vector database integration (Pinecone, Weaviate, Milvus), hybrid cloud deployment, and federated cache learning for privacy-preserving cross-enterprise optimization.</w:t>
+        <w:t>RL-based retention optimization, adaptive weighting, multi-agent memory caching, vector DB integration, hybrid cloud deployment, federated cache learning.</w:t>
       </w:r>
     </w:p>
     <w:p>
@@ -1398,10 +3507,7 @@
         <w:spacing w:after="120"/>
       </w:pPr>
       <w:r>
-        <w:rPr>
-          <w:b w:val="0"/>
-        </w:rPr>
-        <w:t>This paper presented TokenCacheOps and validated its effectiveness through 100,000-request experiments with 30 independent runs. TokenCacheOps achieves 56.4% cache hit ratio, 38.7% token reduction, 45.6% cost reduction, and 52.3x ROI—demonstrating practical value for enterprise AI FinOps governance across cloud-agnostic deployments.</w:t>
+        <w:t>TokenCacheOps achieves 56.4% hit ratio, 38.7% token reduction, 45.6% cost reduction, and 52.3x ROI—demonstrating practical enterprise AI FinOps value.</w:t>
       </w:r>
     </w:p>
     <w:p>
@@ -1417,7 +3523,7 @@
         <w:pStyle w:val="ListNumber"/>
       </w:pPr>
       <w:r>
-        <w:t>[1] OpenAI, "API Pricing," 2024. [Online]. Available: https://openai.com/pricing</w:t>
+        <w:t>[1] OpenAI, "API Pricing," 2024. https://openai.com/pricing</w:t>
       </w:r>
     </w:p>
     <w:p>
@@ -1425,7 +3531,7 @@
         <w:pStyle w:val="ListNumber"/>
       </w:pPr>
       <w:r>
-        <w:t>[2] N. Reimers and I. Gurevych, "Sentence-BERT: Sentence Embeddings using Siamese BERT-Networks," in Proc. EMNLP-IJCNLP, 2019.</w:t>
+        <w:t>[2] N. Reimers and I. Gurevych, "Sentence-BERT," in Proc. EMNLP-IJCNLP, 2019.</w:t>
       </w:r>
     </w:p>
     <w:p>
@@ -1441,7 +3547,7 @@
         <w:pStyle w:val="ListNumber"/>
       </w:pPr>
       <w:r>
-        <w:t>[4] Z. Liu et al., "Cost-Efficient Prompt Caching for Large Language Models," arXiv:2405.08448, 2024.</w:t>
+        <w:t>[4] Z. Liu et al., "Cost-Efficient Prompt Caching," arXiv:2405.08448, 2024.</w:t>
       </w:r>
     </w:p>
     <w:p>
@@ -1449,7 +3555,23 @@
         <w:pStyle w:val="ListNumber"/>
       </w:pPr>
       <w:r>
-        <w:t>[5] M. Chen et al., "FrugalGPT: How to Use Large Language Models While Reducing Cost and Improving Performance," arXiv:2305.05176, 2023.</w:t>
+        <w:t>[5] M. Chen et al., "FrugalGPT," arXiv:2305.05176, 2023.</w:t>
+      </w:r>
+    </w:p>
+    <w:p>
+      <w:pPr>
+        <w:pStyle w:val="Heading1"/>
+      </w:pPr>
+      <w:r>
+        <w:t>APPENDIX A. REPRODUCIBILITY</w:t>
+      </w:r>
+    </w:p>
+    <w:p>
+      <w:pPr>
+        <w:spacing w:after="120"/>
+      </w:pPr>
+      <w:r>
+        <w:t>Source code: tokencacheops/src/. Run: python3 scripts/run_experiments.py. Data: outputs/data/experiment_results.csv (180 rows), ablation_results.csv (150 rows), workload_dataset.csv (100,000 rows). Figures: outputs/figures/. Notebook: notebooks/experiment.ipynb.</w:t>
       </w:r>
     </w:p>
     <w:sectPr>

</xml_diff>